<commit_message>
Completed Step - 4 / Milstone - 3 / Phase - 2
</commit_message>
<xml_diff>
--- a/DOCUMENTS/Project Development Journey.docx
+++ b/DOCUMENTS/Project Development Journey.docx
@@ -106,15 +106,7 @@
     </w:p>
     <w:p>
       <w:r>
-        <w:t>Created the main project folder </w:t>
-      </w:r>
-      <w:proofErr w:type="spellStart"/>
-      <w:r>
-        <w:t>ProcessMind</w:t>
-      </w:r>
-      <w:proofErr w:type="spellEnd"/>
-      <w:r>
-        <w:t>-AI with these directories:</w:t>
+        <w:t>Created the main project folder ProcessMind-AI with these directories:</w:t>
       </w:r>
     </w:p>
     <w:p>
@@ -123,13 +115,8 @@
       </w:r>
     </w:p>
     <w:p>
-      <w:proofErr w:type="spellStart"/>
-      <w:r>
-        <w:t>ProcessMind</w:t>
-      </w:r>
-      <w:proofErr w:type="spellEnd"/>
-      <w:r>
-        <w:t>-AI/</w:t>
+      <w:r>
+        <w:t>ProcessMind-AI/</w:t>
       </w:r>
     </w:p>
     <w:p>
@@ -288,18 +275,8 @@
             <w:b/>
             <w:bCs/>
           </w:rPr>
-          <w:t xml:space="preserve">Spring </w:t>
+          <w:t>Spring Initializr</w:t>
         </w:r>
-        <w:proofErr w:type="spellStart"/>
-        <w:r>
-          <w:rPr>
-            <w:rStyle w:val="Hyperlink"/>
-            <w:b/>
-            <w:bCs/>
-          </w:rPr>
-          <w:t>Initializr</w:t>
-        </w:r>
-        <w:proofErr w:type="spellEnd"/>
       </w:hyperlink>
       <w:r>
         <w:t> to generate the project</w:t>
@@ -363,12 +340,10 @@
       <w:r>
         <w:t>Group: </w:t>
       </w:r>
-      <w:proofErr w:type="spellStart"/>
       <w:proofErr w:type="gramStart"/>
       <w:r>
         <w:t>com.processmind</w:t>
       </w:r>
-      <w:proofErr w:type="spellEnd"/>
       <w:proofErr w:type="gramEnd"/>
     </w:p>
     <w:p>
@@ -379,13 +354,8 @@
         </w:numPr>
       </w:pPr>
       <w:r>
-        <w:t>Artifact: </w:t>
-      </w:r>
-      <w:proofErr w:type="spellStart"/>
-      <w:r>
-        <w:t>processmind-api</w:t>
-      </w:r>
-      <w:proofErr w:type="spellEnd"/>
+        <w:t>Artifact: processmind-api</w:t>
+      </w:r>
     </w:p>
     <w:p>
       <w:pPr>
@@ -395,15 +365,7 @@
         </w:numPr>
       </w:pPr>
       <w:r>
-        <w:t>Name: </w:t>
-      </w:r>
-      <w:proofErr w:type="spellStart"/>
-      <w:r>
-        <w:t>ProcessMind</w:t>
-      </w:r>
-      <w:proofErr w:type="spellEnd"/>
-      <w:r>
-        <w:t xml:space="preserve"> API</w:t>
+        <w:t>Name: ProcessMind API</w:t>
       </w:r>
     </w:p>
     <w:p>
@@ -416,12 +378,10 @@
       <w:r>
         <w:t>Package: </w:t>
       </w:r>
-      <w:proofErr w:type="spellStart"/>
       <w:proofErr w:type="gramStart"/>
       <w:r>
         <w:t>com.processmind</w:t>
       </w:r>
-      <w:proofErr w:type="spellEnd"/>
       <w:proofErr w:type="gramEnd"/>
     </w:p>
     <w:p>
@@ -704,19 +664,9 @@
               <w:spacing w:after="160" w:line="278" w:lineRule="auto"/>
               <w:cnfStyle w:val="000000000000" w:firstRow="0" w:lastRow="0" w:firstColumn="0" w:lastColumn="0" w:oddVBand="0" w:evenVBand="0" w:oddHBand="0" w:evenHBand="0" w:firstRowFirstColumn="0" w:firstRowLastColumn="0" w:lastRowFirstColumn="0" w:lastRowLastColumn="0"/>
             </w:pPr>
-            <w:proofErr w:type="spellStart"/>
-            <w:r>
-              <w:t>SpringDoc</w:t>
-            </w:r>
-            <w:proofErr w:type="spellEnd"/>
-            <w:r>
-              <w:t xml:space="preserve"> </w:t>
-            </w:r>
-            <w:proofErr w:type="spellStart"/>
-            <w:r>
-              <w:t>OpenAPI</w:t>
-            </w:r>
-            <w:proofErr w:type="spellEnd"/>
+            <w:r>
+              <w:t>SpringDoc OpenAPI</w:t>
+            </w:r>
           </w:p>
         </w:tc>
       </w:tr>
@@ -769,26 +719,14 @@
       <w:r>
         <w:t>Downloaded PostgreSQL 17 from </w:t>
       </w:r>
-      <w:proofErr w:type="spellStart"/>
-      <w:r>
-        <w:fldChar w:fldCharType="begin"/>
-      </w:r>
-      <w:r>
-        <w:instrText>HYPERLINK "https://www.enterprisedb.com/downloads/postgres-postgresql-downloads" \t "_blank"</w:instrText>
-      </w:r>
-      <w:r>
-        <w:fldChar w:fldCharType="separate"/>
-      </w:r>
-      <w:r>
-        <w:rPr>
-          <w:rStyle w:val="Hyperlink"/>
-        </w:rPr>
-        <w:t>EnterpriseDB</w:t>
-      </w:r>
-      <w:proofErr w:type="spellEnd"/>
-      <w:r>
-        <w:fldChar w:fldCharType="end"/>
-      </w:r>
+      <w:hyperlink r:id="rId6" w:tgtFrame="_blank" w:history="1">
+        <w:r>
+          <w:rPr>
+            <w:rStyle w:val="Hyperlink"/>
+          </w:rPr>
+          <w:t>EnterpriseDB</w:t>
+        </w:r>
+      </w:hyperlink>
     </w:p>
     <w:p>
       <w:pPr>
@@ -813,13 +751,8 @@
         </w:numPr>
       </w:pPr>
       <w:r>
-        <w:t>Username: </w:t>
-      </w:r>
-      <w:proofErr w:type="spellStart"/>
-      <w:r>
-        <w:t>postgres</w:t>
-      </w:r>
-      <w:proofErr w:type="spellEnd"/>
+        <w:t>Username: postgres</w:t>
+      </w:r>
     </w:p>
     <w:p>
       <w:pPr>
@@ -855,17 +788,8 @@
           <w:b/>
           <w:bCs/>
         </w:rPr>
-        <w:t xml:space="preserve">5. Installed </w:t>
-      </w:r>
-      <w:proofErr w:type="spellStart"/>
-      <w:r>
-        <w:rPr>
-          <w:b/>
-          <w:bCs/>
-        </w:rPr>
-        <w:t>pgAdmin</w:t>
-      </w:r>
-      <w:proofErr w:type="spellEnd"/>
+        <w:t>5. Installed pgAdmin</w:t>
+      </w:r>
     </w:p>
     <w:p>
       <w:pPr>
@@ -912,21 +836,8 @@
         </w:numPr>
       </w:pPr>
       <w:r>
-        <w:t>Created </w:t>
-      </w:r>
-      <w:proofErr w:type="spellStart"/>
-      <w:r>
-        <w:t>processmind_db</w:t>
-      </w:r>
-      <w:proofErr w:type="spellEnd"/>
-      <w:r>
-        <w:t xml:space="preserve"> database in </w:t>
-      </w:r>
-      <w:proofErr w:type="spellStart"/>
-      <w:r>
-        <w:t>pgAdmin</w:t>
-      </w:r>
-      <w:proofErr w:type="spellEnd"/>
+        <w:t>Created processmind_db database in pgAdmin</w:t>
+      </w:r>
     </w:p>
     <w:p>
       <w:pPr>
@@ -993,7 +904,7 @@
                     <pic:cNvPicPr/>
                   </pic:nvPicPr>
                   <pic:blipFill>
-                    <a:blip r:embed="rId6"/>
+                    <a:blip r:embed="rId7"/>
                     <a:stretch>
                       <a:fillRect/>
                     </a:stretch>
@@ -1050,21 +961,8 @@
       </w:r>
     </w:p>
     <w:p>
-      <w:proofErr w:type="spellStart"/>
-      <w:r>
-        <w:t>src</w:t>
-      </w:r>
-      <w:proofErr w:type="spellEnd"/>
-      <w:r>
-        <w:t>/main/java/com/</w:t>
-      </w:r>
-      <w:proofErr w:type="spellStart"/>
-      <w:r>
-        <w:t>processmind</w:t>
-      </w:r>
-      <w:proofErr w:type="spellEnd"/>
-      <w:r>
-        <w:t>/</w:t>
+      <w:r>
+        <w:t>src/main/java/com/processmind/</w:t>
       </w:r>
     </w:p>
     <w:p>
@@ -1158,15 +1056,7 @@
         <w:t>──</w:t>
       </w:r>
       <w:r>
-        <w:t xml:space="preserve"> </w:t>
-      </w:r>
-      <w:proofErr w:type="spellStart"/>
-      <w:r>
-        <w:t>dto</w:t>
-      </w:r>
-      <w:proofErr w:type="spellEnd"/>
-      <w:r>
-        <w:t>/</w:t>
+        <w:t xml:space="preserve"> dto/</w:t>
       </w:r>
     </w:p>
     <w:p>
@@ -1186,15 +1076,7 @@
         <w:t>──</w:t>
       </w:r>
       <w:r>
-        <w:t xml:space="preserve"> </w:t>
-      </w:r>
-      <w:proofErr w:type="spellStart"/>
-      <w:r>
-        <w:t>enums</w:t>
-      </w:r>
-      <w:proofErr w:type="spellEnd"/>
-      <w:r>
-        <w:t>/</w:t>
+        <w:t xml:space="preserve"> enums/</w:t>
       </w:r>
     </w:p>
     <w:p>
@@ -1543,13 +1425,8 @@
           <w:numId w:val="5"/>
         </w:numPr>
       </w:pPr>
-      <w:proofErr w:type="spellStart"/>
-      <w:r>
-        <w:t>dto</w:t>
-      </w:r>
-      <w:proofErr w:type="spellEnd"/>
-      <w:r>
-        <w:t>/</w:t>
+      <w:r>
+        <w:t>dto/</w:t>
       </w:r>
     </w:p>
     <w:p>
@@ -1622,13 +1499,8 @@
       </w:r>
     </w:p>
     <w:p>
-      <w:proofErr w:type="spellStart"/>
-      <w:r>
-        <w:t>src</w:t>
-      </w:r>
-      <w:proofErr w:type="spellEnd"/>
-      <w:r>
-        <w:t>/main/resources/</w:t>
+      <w:r>
+        <w:t>src/main/resources/</w:t>
       </w:r>
     </w:p>
     <w:p>
@@ -1645,15 +1517,7 @@
         <w:t>──</w:t>
       </w:r>
       <w:r>
-        <w:t xml:space="preserve"> </w:t>
-      </w:r>
-      <w:proofErr w:type="spellStart"/>
-      <w:r>
-        <w:t>application.yml</w:t>
-      </w:r>
-      <w:proofErr w:type="spellEnd"/>
-      <w:r>
-        <w:t xml:space="preserve">       </w:t>
+        <w:t xml:space="preserve"> application.yml       </w:t>
       </w:r>
       <w:proofErr w:type="gramStart"/>
       <w:r>
@@ -1678,15 +1542,7 @@
         <w:t>──</w:t>
       </w:r>
       <w:r>
-        <w:t xml:space="preserve"> application-</w:t>
-      </w:r>
-      <w:proofErr w:type="spellStart"/>
-      <w:r>
-        <w:t>dev.yml</w:t>
-      </w:r>
-      <w:proofErr w:type="spellEnd"/>
-      <w:r>
-        <w:t xml:space="preserve">   </w:t>
+        <w:t xml:space="preserve"> application-dev.yml   </w:t>
       </w:r>
       <w:proofErr w:type="gramStart"/>
       <w:r>
@@ -1711,15 +1567,7 @@
         <w:t>──</w:t>
       </w:r>
       <w:r>
-        <w:t xml:space="preserve"> application-</w:t>
-      </w:r>
-      <w:proofErr w:type="spellStart"/>
-      <w:r>
-        <w:t>prod.yml</w:t>
-      </w:r>
-      <w:proofErr w:type="spellEnd"/>
-      <w:r>
-        <w:t xml:space="preserve">  </w:t>
+        <w:t xml:space="preserve"> application-prod.yml  </w:t>
       </w:r>
       <w:proofErr w:type="gramStart"/>
       <w:r>
@@ -1744,15 +1592,7 @@
         <w:t>──</w:t>
       </w:r>
       <w:r>
-        <w:t xml:space="preserve"> </w:t>
-      </w:r>
-      <w:proofErr w:type="spellStart"/>
-      <w:r>
-        <w:t>db</w:t>
-      </w:r>
-      <w:proofErr w:type="spellEnd"/>
-      <w:r>
-        <w:t>/</w:t>
+        <w:t xml:space="preserve"> db/</w:t>
       </w:r>
     </w:p>
     <w:p>
@@ -1825,7 +1665,7 @@
                     <pic:cNvPicPr/>
                   </pic:nvPicPr>
                   <pic:blipFill>
-                    <a:blip r:embed="rId7"/>
+                    <a:blip r:embed="rId8"/>
                     <a:stretch>
                       <a:fillRect/>
                     </a:stretch>
@@ -1895,15 +1735,7 @@
         </w:numPr>
       </w:pPr>
       <w:r>
-        <w:t xml:space="preserve">Content: CREATE SCHEMA IF NOT EXISTS </w:t>
-      </w:r>
-      <w:proofErr w:type="spellStart"/>
-      <w:r>
-        <w:t>processmind</w:t>
-      </w:r>
-      <w:proofErr w:type="spellEnd"/>
-      <w:r>
-        <w:t>;</w:t>
+        <w:t>Content: CREATE SCHEMA IF NOT EXISTS processmind;</w:t>
       </w:r>
     </w:p>
     <w:p>
@@ -1945,17 +1777,8 @@
           <w:b/>
           <w:bCs/>
         </w:rPr>
-        <w:t xml:space="preserve">12. Created </w:t>
-      </w:r>
-      <w:proofErr w:type="spellStart"/>
-      <w:r>
-        <w:rPr>
-          <w:b/>
-          <w:bCs/>
-        </w:rPr>
-        <w:t>HealthController</w:t>
-      </w:r>
-      <w:proofErr w:type="spellEnd"/>
+        <w:t>12. Created HealthController</w:t>
+      </w:r>
     </w:p>
     <w:p>
       <w:r>
@@ -1979,7 +1802,7 @@
                     <pic:cNvPicPr/>
                   </pic:nvPicPr>
                   <pic:blipFill>
-                    <a:blip r:embed="rId8"/>
+                    <a:blip r:embed="rId9"/>
                     <a:stretch>
                       <a:fillRect/>
                     </a:stretch>
@@ -2012,17 +1835,8 @@
           <w:b/>
           <w:bCs/>
         </w:rPr>
-        <w:t xml:space="preserve">13. Created </w:t>
-      </w:r>
-      <w:proofErr w:type="spellStart"/>
-      <w:r>
-        <w:rPr>
-          <w:b/>
-          <w:bCs/>
-        </w:rPr>
-        <w:t>SecurityConfig</w:t>
-      </w:r>
-      <w:proofErr w:type="spellEnd"/>
+        <w:t>13. Created SecurityConfig</w:t>
+      </w:r>
     </w:p>
     <w:p>
       <w:pPr>
@@ -2051,7 +1865,7 @@
                     <pic:cNvPicPr/>
                   </pic:nvPicPr>
                   <pic:blipFill>
-                    <a:blip r:embed="rId9"/>
+                    <a:blip r:embed="rId10"/>
                     <a:stretch>
                       <a:fillRect/>
                     </a:stretch>
@@ -2125,34 +1939,16 @@
       <w:r>
         <w:t>Command: </w:t>
       </w:r>
-      <w:proofErr w:type="spellStart"/>
-      <w:r>
-        <w:t>mvn</w:t>
-      </w:r>
-      <w:proofErr w:type="spellEnd"/>
-      <w:r>
-        <w:t xml:space="preserve"> clean </w:t>
-      </w:r>
-      <w:proofErr w:type="spellStart"/>
-      <w:r>
-        <w:t>spring-</w:t>
+      <w:r>
+        <w:t>mvn clean spring-</w:t>
       </w:r>
       <w:proofErr w:type="gramStart"/>
       <w:r>
         <w:t>boot:run</w:t>
       </w:r>
-      <w:proofErr w:type="spellEnd"/>
       <w:proofErr w:type="gramEnd"/>
       <w:r>
-        <w:t xml:space="preserve"> "-</w:t>
-      </w:r>
-      <w:proofErr w:type="spellStart"/>
-      <w:r>
-        <w:t>Dspring-boot.run.profiles</w:t>
-      </w:r>
-      <w:proofErr w:type="spellEnd"/>
-      <w:r>
-        <w:t>=dev"</w:t>
+        <w:t xml:space="preserve"> "-Dspring-boot.run.profiles=dev"</w:t>
       </w:r>
     </w:p>
     <w:p>
@@ -2306,13 +2102,8 @@
               <w:spacing w:after="160" w:line="278" w:lineRule="auto"/>
               <w:cnfStyle w:val="000000100000" w:firstRow="0" w:lastRow="0" w:firstColumn="0" w:lastColumn="0" w:oddVBand="0" w:evenVBand="0" w:oddHBand="1" w:evenHBand="0" w:firstRowFirstColumn="0" w:firstRowLastColumn="0" w:lastRowFirstColumn="0" w:lastRowLastColumn="0"/>
             </w:pPr>
-            <w:proofErr w:type="spellStart"/>
-            <w:r>
-              <w:t>ProcessMind</w:t>
-            </w:r>
-            <w:proofErr w:type="spellEnd"/>
-            <w:r>
-              <w:t xml:space="preserve"> API is running</w:t>
+            <w:r>
+              <w:t>ProcessMind API is running</w:t>
             </w:r>
           </w:p>
         </w:tc>
@@ -2425,15 +2216,7 @@
               <w:cnfStyle w:val="000000100000" w:firstRow="0" w:lastRow="0" w:firstColumn="0" w:lastColumn="0" w:oddVBand="0" w:evenVBand="0" w:oddHBand="1" w:evenHBand="0" w:firstRowFirstColumn="0" w:firstRowLastColumn="0" w:lastRowFirstColumn="0" w:lastRowLastColumn="0"/>
             </w:pPr>
             <w:r>
-              <w:t>{"</w:t>
-            </w:r>
-            <w:proofErr w:type="spellStart"/>
-            <w:r>
-              <w:t>status":"UP</w:t>
-            </w:r>
-            <w:proofErr w:type="spellEnd"/>
-            <w:r>
-              <w:t>"}</w:t>
+              <w:t>{"status":"UP"}</w:t>
             </w:r>
           </w:p>
         </w:tc>
@@ -2477,15 +2260,7 @@
         <w:t>✅</w:t>
       </w:r>
       <w:r>
-        <w:t xml:space="preserve"> </w:t>
-      </w:r>
-      <w:proofErr w:type="spellStart"/>
-      <w:r>
-        <w:t>HikariCP</w:t>
-      </w:r>
-      <w:proofErr w:type="spellEnd"/>
-      <w:r>
-        <w:t xml:space="preserve"> connection pool started</w:t>
+        <w:t xml:space="preserve"> HikariCP connection pool started</w:t>
       </w:r>
     </w:p>
     <w:p>
@@ -2970,19 +2745,9 @@
             <w:pPr>
               <w:spacing w:after="160" w:line="278" w:lineRule="auto"/>
             </w:pPr>
-            <w:proofErr w:type="spellStart"/>
-            <w:r>
-              <w:t>SpringDoc</w:t>
-            </w:r>
-            <w:proofErr w:type="spellEnd"/>
-            <w:r>
-              <w:t xml:space="preserve"> </w:t>
-            </w:r>
-            <w:proofErr w:type="spellStart"/>
-            <w:r>
-              <w:t>OpenAPI</w:t>
-            </w:r>
-            <w:proofErr w:type="spellEnd"/>
+            <w:r>
+              <w:t>SpringDoc OpenAPI</w:t>
+            </w:r>
           </w:p>
         </w:tc>
         <w:tc>
@@ -3323,7 +3088,7 @@
                     <pic:cNvPicPr/>
                   </pic:nvPicPr>
                   <pic:blipFill>
-                    <a:blip r:embed="rId10"/>
+                    <a:blip r:embed="rId11"/>
                     <a:stretch>
                       <a:fillRect/>
                     </a:stretch>
@@ -3905,7 +3670,7 @@
                     <pic:cNvPicPr/>
                   </pic:nvPicPr>
                   <pic:blipFill>
-                    <a:blip r:embed="rId11"/>
+                    <a:blip r:embed="rId12"/>
                     <a:stretch>
                       <a:fillRect/>
                     </a:stretch>
@@ -4143,11 +3908,9 @@
             <w:pPr>
               <w:spacing w:after="160" w:line="278" w:lineRule="auto"/>
             </w:pPr>
-            <w:proofErr w:type="spellStart"/>
             <w:r>
               <w:t>MethodArgumentNotValidException</w:t>
             </w:r>
-            <w:proofErr w:type="spellEnd"/>
           </w:p>
         </w:tc>
         <w:tc>
@@ -4195,11 +3958,9 @@
             <w:pPr>
               <w:spacing w:after="160" w:line="278" w:lineRule="auto"/>
             </w:pPr>
-            <w:proofErr w:type="spellStart"/>
             <w:r>
               <w:t>AccessDeniedException</w:t>
             </w:r>
-            <w:proofErr w:type="spellEnd"/>
           </w:p>
         </w:tc>
         <w:tc>
@@ -4248,11 +4009,9 @@
             <w:pPr>
               <w:spacing w:after="160" w:line="278" w:lineRule="auto"/>
             </w:pPr>
-            <w:proofErr w:type="spellStart"/>
             <w:r>
               <w:t>NoHandlerFoundException</w:t>
             </w:r>
-            <w:proofErr w:type="spellEnd"/>
           </w:p>
         </w:tc>
         <w:tc>
@@ -4419,15 +4178,7 @@
         </w:numPr>
       </w:pPr>
       <w:r>
-        <w:t xml:space="preserve">Extends </w:t>
-      </w:r>
-      <w:proofErr w:type="spellStart"/>
-      <w:r>
-        <w:t>RuntimeException</w:t>
-      </w:r>
-      <w:proofErr w:type="spellEnd"/>
-      <w:r>
-        <w:t xml:space="preserve"> (unchecked)</w:t>
+        <w:t>Extends RuntimeException (unchecked)</w:t>
       </w:r>
     </w:p>
     <w:p>
@@ -4460,7 +4211,7 @@
                     <pic:cNvPicPr/>
                   </pic:nvPicPr>
                   <pic:blipFill>
-                    <a:blip r:embed="rId12"/>
+                    <a:blip r:embed="rId13"/>
                     <a:stretch>
                       <a:fillRect/>
                     </a:stretch>
@@ -4539,15 +4290,7 @@
         </w:numPr>
       </w:pPr>
       <w:r>
-        <w:t>Uses </w:t>
-      </w:r>
-      <w:proofErr w:type="spellStart"/>
-      <w:r>
-        <w:t>ApiResponse</w:t>
-      </w:r>
-      <w:proofErr w:type="spellEnd"/>
-      <w:r>
-        <w:t> wrapper</w:t>
+        <w:t>Uses ApiResponse wrapper</w:t>
       </w:r>
     </w:p>
     <w:p>
@@ -4603,7 +4346,7 @@
                     <pic:cNvPicPr/>
                   </pic:nvPicPr>
                   <pic:blipFill>
-                    <a:blip r:embed="rId13"/>
+                    <a:blip r:embed="rId14"/>
                     <a:stretch>
                       <a:fillRect/>
                     </a:stretch>
@@ -4648,15 +4391,7 @@
         <w:t>Location:</w:t>
       </w:r>
       <w:r>
-        <w:t> </w:t>
-      </w:r>
-      <w:proofErr w:type="spellStart"/>
-      <w:r>
-        <w:t>src</w:t>
-      </w:r>
-      <w:proofErr w:type="spellEnd"/>
-      <w:r>
-        <w:t>/main/resources/logback-spring.xml</w:t>
+        <w:t> src/main/resources/logback-spring.xml</w:t>
       </w:r>
     </w:p>
     <w:p>
@@ -4739,12 +4474,10 @@
           <w:numId w:val="18"/>
         </w:numPr>
       </w:pPr>
-      <w:proofErr w:type="spellStart"/>
       <w:proofErr w:type="gramStart"/>
       <w:r>
         <w:t>com.processmind</w:t>
       </w:r>
-      <w:proofErr w:type="spellEnd"/>
       <w:proofErr w:type="gramEnd"/>
       <w:r>
         <w:t>: DEBUG</w:t>
@@ -4757,13 +4490,8 @@
           <w:numId w:val="18"/>
         </w:numPr>
       </w:pPr>
-      <w:proofErr w:type="spellStart"/>
-      <w:r>
-        <w:t>org.springframework.web</w:t>
-      </w:r>
-      <w:proofErr w:type="spellEnd"/>
-      <w:r>
-        <w:t>: DEBUG</w:t>
+      <w:r>
+        <w:t>org.springframework.web: DEBUG</w:t>
       </w:r>
     </w:p>
     <w:p>
@@ -4773,13 +4501,8 @@
           <w:numId w:val="18"/>
         </w:numPr>
       </w:pPr>
-      <w:proofErr w:type="spellStart"/>
-      <w:r>
-        <w:t>org.hibernate.SQL</w:t>
-      </w:r>
-      <w:proofErr w:type="spellEnd"/>
-      <w:r>
-        <w:t>: DEBUG</w:t>
+      <w:r>
+        <w:t>org.hibernate.SQL: DEBUG</w:t>
       </w:r>
     </w:p>
     <w:p>
@@ -4829,19 +4552,9 @@
           <w:numId w:val="19"/>
         </w:numPr>
       </w:pPr>
-      <w:proofErr w:type="spellStart"/>
-      <w:r>
-        <w:t>src</w:t>
-      </w:r>
-      <w:proofErr w:type="spellEnd"/>
-      <w:r>
-        <w:t>/main/resources/</w:t>
-      </w:r>
-      <w:proofErr w:type="spellStart"/>
-      <w:r>
-        <w:t>application.yml</w:t>
-      </w:r>
-      <w:proofErr w:type="spellEnd"/>
+      <w:r>
+        <w:t>src/main/resources/application.yml</w:t>
+      </w:r>
     </w:p>
     <w:p>
       <w:pPr>
@@ -4850,19 +4563,9 @@
           <w:numId w:val="19"/>
         </w:numPr>
       </w:pPr>
-      <w:proofErr w:type="spellStart"/>
-      <w:r>
-        <w:t>src</w:t>
-      </w:r>
-      <w:proofErr w:type="spellEnd"/>
-      <w:r>
-        <w:t>/main/resources/application-</w:t>
-      </w:r>
-      <w:proofErr w:type="spellStart"/>
-      <w:r>
-        <w:t>dev.yml</w:t>
-      </w:r>
-      <w:proofErr w:type="spellEnd"/>
+      <w:r>
+        <w:t>src/main/resources/application-dev.yml</w:t>
+      </w:r>
     </w:p>
     <w:p>
       <w:pPr>
@@ -4871,19 +4574,9 @@
           <w:numId w:val="19"/>
         </w:numPr>
       </w:pPr>
-      <w:proofErr w:type="spellStart"/>
-      <w:r>
-        <w:t>src</w:t>
-      </w:r>
-      <w:proofErr w:type="spellEnd"/>
-      <w:r>
-        <w:t>/main/resources/application-</w:t>
-      </w:r>
-      <w:proofErr w:type="spellStart"/>
-      <w:r>
-        <w:t>prod.yml</w:t>
-      </w:r>
-      <w:proofErr w:type="spellEnd"/>
+      <w:r>
+        <w:t>src/main/resources/application-prod.yml</w:t>
+      </w:r>
     </w:p>
     <w:p>
       <w:pPr>
@@ -4985,7 +4678,7 @@
                     <pic:cNvPicPr/>
                   </pic:nvPicPr>
                   <pic:blipFill>
-                    <a:blip r:embed="rId14"/>
+                    <a:blip r:embed="rId15"/>
                     <a:stretch>
                       <a:fillRect/>
                     </a:stretch>
@@ -5337,13 +5030,8 @@
         </w:numPr>
       </w:pPr>
       <w:r>
-        <w:t>backend/</w:t>
-      </w:r>
-      <w:proofErr w:type="spellStart"/>
-      <w:r>
-        <w:t>Dockerfile</w:t>
-      </w:r>
-      <w:proofErr w:type="spellEnd"/>
+        <w:t>backend/Dockerfile</w:t>
+      </w:r>
     </w:p>
     <w:p>
       <w:pPr>
@@ -5353,13 +5041,8 @@
         </w:numPr>
       </w:pPr>
       <w:r>
-        <w:t>docker/docker-</w:t>
-      </w:r>
-      <w:proofErr w:type="spellStart"/>
-      <w:r>
-        <w:t>compose.yml</w:t>
-      </w:r>
-      <w:proofErr w:type="spellEnd"/>
+        <w:t>docker/docker-compose.yml</w:t>
+      </w:r>
     </w:p>
     <w:p>
       <w:pPr>
@@ -5368,19 +5051,9 @@
           <w:numId w:val="22"/>
         </w:numPr>
       </w:pPr>
-      <w:proofErr w:type="spellStart"/>
-      <w:r>
-        <w:t>ProcessMind</w:t>
-      </w:r>
-      <w:proofErr w:type="spellEnd"/>
-      <w:r>
-        <w:t>-AI/docker-</w:t>
-      </w:r>
-      <w:proofErr w:type="spellStart"/>
-      <w:r>
-        <w:t>compose.yml</w:t>
-      </w:r>
-      <w:proofErr w:type="spellEnd"/>
+      <w:r>
+        <w:t>ProcessMind-AI/docker-compose.yml</w:t>
+      </w:r>
     </w:p>
     <w:p>
       <w:r>
@@ -5477,7 +5150,7 @@
                     <pic:cNvPicPr/>
                   </pic:nvPicPr>
                   <pic:blipFill>
-                    <a:blip r:embed="rId15"/>
+                    <a:blip r:embed="rId16"/>
                     <a:stretch>
                       <a:fillRect/>
                     </a:stretch>
@@ -5567,7 +5240,7 @@
                     <pic:cNvPicPr/>
                   </pic:nvPicPr>
                   <pic:blipFill>
-                    <a:blip r:embed="rId16"/>
+                    <a:blip r:embed="rId17"/>
                     <a:stretch>
                       <a:fillRect/>
                     </a:stretch>
@@ -5819,13 +5492,8 @@
               <w:cnfStyle w:val="000000000000" w:firstRow="0" w:lastRow="0" w:firstColumn="0" w:lastColumn="0" w:oddVBand="0" w:evenVBand="0" w:oddHBand="0" w:evenHBand="0" w:firstRowFirstColumn="0" w:firstRowLastColumn="0" w:lastRowFirstColumn="0" w:lastRowLastColumn="0"/>
             </w:pPr>
             <w:r>
-              <w:t xml:space="preserve">JSON response with </w:t>
-            </w:r>
-            <w:proofErr w:type="spellStart"/>
-            <w:r>
-              <w:t>ApiResponse</w:t>
-            </w:r>
-            <w:proofErr w:type="spellEnd"/>
+              <w:t>JSON response with ApiResponse</w:t>
+            </w:r>
           </w:p>
         </w:tc>
       </w:tr>
@@ -6186,7 +5854,7 @@
                     <pic:cNvPicPr/>
                   </pic:nvPicPr>
                   <pic:blipFill>
-                    <a:blip r:embed="rId17"/>
+                    <a:blip r:embed="rId18"/>
                     <a:stretch>
                       <a:fillRect/>
                     </a:stretch>
@@ -6269,7 +5937,7 @@
                     <pic:cNvPicPr/>
                   </pic:nvPicPr>
                   <pic:blipFill>
-                    <a:blip r:embed="rId18"/>
+                    <a:blip r:embed="rId19"/>
                     <a:stretch>
                       <a:fillRect/>
                     </a:stretch>
@@ -6332,7 +6000,7 @@
                     <pic:cNvPicPr/>
                   </pic:nvPicPr>
                   <pic:blipFill>
-                    <a:blip r:embed="rId19"/>
+                    <a:blip r:embed="rId20"/>
                     <a:stretch>
                       <a:fillRect/>
                     </a:stretch>
@@ -6389,7 +6057,7 @@
                     <pic:cNvPicPr/>
                   </pic:nvPicPr>
                   <pic:blipFill>
-                    <a:blip r:embed="rId20"/>
+                    <a:blip r:embed="rId21"/>
                     <a:stretch>
                       <a:fillRect/>
                     </a:stretch>
@@ -6419,14 +6087,6 @@
     <w:p/>
     <w:p/>
     <w:p/>
-    <w:p/>
-    <w:p/>
-    <w:p/>
-    <w:p/>
-    <w:p/>
-    <w:p/>
-    <w:p/>
-    <w:p/>
     <w:p>
       <w:pPr>
         <w:rPr>
@@ -6443,61 +6103,8 @@
           <w:sz w:val="30"/>
           <w:szCs w:val="30"/>
         </w:rPr>
-        <w:t>Date: 1</w:t>
-      </w:r>
-      <w:r>
-        <w:rPr>
-          <w:b/>
-          <w:bCs/>
-          <w:sz w:val="30"/>
-          <w:szCs w:val="30"/>
-        </w:rPr>
-        <w:t>9</w:t>
-      </w:r>
-      <w:r>
-        <w:rPr>
-          <w:b/>
-          <w:bCs/>
-          <w:sz w:val="30"/>
-          <w:szCs w:val="30"/>
-        </w:rPr>
-        <w:t xml:space="preserve">.06.2026 – </w:t>
-      </w:r>
-      <w:r>
-        <w:rPr>
-          <w:b/>
-          <w:bCs/>
-          <w:sz w:val="30"/>
-          <w:szCs w:val="30"/>
-        </w:rPr>
-        <w:t>9</w:t>
-      </w:r>
-      <w:r>
-        <w:rPr>
-          <w:b/>
-          <w:bCs/>
-          <w:sz w:val="30"/>
-          <w:szCs w:val="30"/>
-        </w:rPr>
-        <w:t>.</w:t>
-      </w:r>
-      <w:r>
-        <w:rPr>
-          <w:b/>
-          <w:bCs/>
-          <w:sz w:val="30"/>
-          <w:szCs w:val="30"/>
-        </w:rPr>
-        <w:t>35</w:t>
-      </w:r>
-      <w:r>
-        <w:rPr>
-          <w:b/>
-          <w:bCs/>
-          <w:sz w:val="30"/>
-          <w:szCs w:val="30"/>
-        </w:rPr>
-        <w:t xml:space="preserve"> PM</w:t>
+        <w:lastRenderedPageBreak/>
+        <w:t>Date: 19.06.2026 – 9.35 PM</w:t>
       </w:r>
     </w:p>
     <w:p>
@@ -6536,15 +6143,7 @@
     </w:p>
     <w:p>
       <w:r>
-        <w:t xml:space="preserve">Build the complete identity and access management platform that provides secure authentication, authorization, and tenant isolation for the </w:t>
-      </w:r>
-      <w:proofErr w:type="spellStart"/>
-      <w:r>
-        <w:t>ProcessMind</w:t>
-      </w:r>
-      <w:proofErr w:type="spellEnd"/>
-      <w:r>
-        <w:t xml:space="preserve"> AI system.</w:t>
+        <w:t>Build the complete identity and access management platform that provides secure authentication, authorization, and tenant isolation for the ProcessMind AI system.</w:t>
       </w:r>
     </w:p>
     <w:p>
@@ -6746,6 +6345,36 @@
           <w:rFonts w:ascii="Segoe UI Emoji" w:hAnsi="Segoe UI Emoji" w:cs="Segoe UI Emoji"/>
         </w:rPr>
       </w:pPr>
+    </w:p>
+    <w:p>
+      <w:pPr>
+        <w:rPr>
+          <w:rFonts w:ascii="Segoe UI Emoji" w:hAnsi="Segoe UI Emoji" w:cs="Segoe UI Emoji"/>
+          <w:b/>
+          <w:bCs/>
+          <w:sz w:val="28"/>
+          <w:szCs w:val="28"/>
+        </w:rPr>
+      </w:pPr>
+      <w:r>
+        <w:rPr>
+          <w:rFonts w:ascii="Segoe UI Emoji" w:hAnsi="Segoe UI Emoji" w:cs="Segoe UI Emoji"/>
+          <w:b/>
+          <w:bCs/>
+          <w:sz w:val="28"/>
+          <w:szCs w:val="28"/>
+        </w:rPr>
+        <w:t xml:space="preserve">Milestone 03 - </w:t>
+      </w:r>
+      <w:r>
+        <w:rPr>
+          <w:b/>
+          <w:bCs/>
+          <w:sz w:val="28"/>
+          <w:szCs w:val="28"/>
+        </w:rPr>
+        <w:t>Auth Foundation</w:t>
+      </w:r>
     </w:p>
     <w:p>
       <w:pPr>
@@ -6779,12 +6408,12 @@
           <w:rFonts w:ascii="Segoe UI Emoji" w:hAnsi="Segoe UI Emoji" w:cs="Segoe UI Emoji"/>
           <w:b/>
           <w:bCs/>
-        </w:rPr>
-        <w:lastRenderedPageBreak/>
+          <w:noProof/>
+        </w:rPr>
         <w:drawing>
-          <wp:inline distT="0" distB="0" distL="0" distR="0" wp14:anchorId="0AA9DFEE" wp14:editId="4253D533">
-            <wp:extent cx="3352800" cy="2929714"/>
-            <wp:effectExtent l="0" t="0" r="0" b="4445"/>
+          <wp:inline distT="0" distB="0" distL="0" distR="0" wp14:anchorId="0AA9DFEE" wp14:editId="1085EF04">
+            <wp:extent cx="4035177" cy="3525982"/>
+            <wp:effectExtent l="0" t="0" r="3810" b="0"/>
             <wp:docPr id="1448862889" name="Picture 1"/>
             <wp:cNvGraphicFramePr>
               <a:graphicFrameLocks xmlns:a="http://schemas.openxmlformats.org/drawingml/2006/main" noChangeAspect="1"/>
@@ -6797,7 +6426,7 @@
                     <pic:cNvPicPr/>
                   </pic:nvPicPr>
                   <pic:blipFill rotWithShape="1">
-                    <a:blip r:embed="rId21"/>
+                    <a:blip r:embed="rId22"/>
                     <a:srcRect t="14571"/>
                     <a:stretch>
                       <a:fillRect/>
@@ -6806,7 +6435,7 @@
                   <pic:spPr bwMode="auto">
                     <a:xfrm>
                       <a:off x="0" y="0"/>
-                      <a:ext cx="3365486" cy="2940799"/>
+                      <a:ext cx="4085352" cy="3569826"/>
                     </a:xfrm>
                     <a:prstGeom prst="rect">
                       <a:avLst/>
@@ -6839,11 +6468,12 @@
           <w:rFonts w:ascii="Segoe UI Emoji" w:hAnsi="Segoe UI Emoji" w:cs="Segoe UI Emoji"/>
           <w:b/>
           <w:bCs/>
+          <w:noProof/>
         </w:rPr>
         <w:drawing>
-          <wp:inline distT="0" distB="0" distL="0" distR="0" wp14:anchorId="42089338" wp14:editId="0FAC59A7">
-            <wp:extent cx="6090737" cy="2798619"/>
-            <wp:effectExtent l="0" t="0" r="5715" b="1905"/>
+          <wp:inline distT="0" distB="0" distL="0" distR="0" wp14:anchorId="42089338" wp14:editId="37587446">
+            <wp:extent cx="4856018" cy="2231281"/>
+            <wp:effectExtent l="0" t="0" r="1905" b="0"/>
             <wp:docPr id="829943528" name="Picture 1"/>
             <wp:cNvGraphicFramePr>
               <a:graphicFrameLocks xmlns:a="http://schemas.openxmlformats.org/drawingml/2006/main" noChangeAspect="1"/>
@@ -6856,7 +6486,7 @@
                     <pic:cNvPicPr/>
                   </pic:nvPicPr>
                   <pic:blipFill>
-                    <a:blip r:embed="rId22"/>
+                    <a:blip r:embed="rId23"/>
                     <a:stretch>
                       <a:fillRect/>
                     </a:stretch>
@@ -6864,7 +6494,7 @@
                   <pic:spPr>
                     <a:xfrm>
                       <a:off x="0" y="0"/>
-                      <a:ext cx="6124860" cy="2814298"/>
+                      <a:ext cx="4940617" cy="2270153"/>
                     </a:xfrm>
                     <a:prstGeom prst="rect">
                       <a:avLst/>
@@ -6877,19 +6507,19 @@
         </w:drawing>
       </w:r>
     </w:p>
-    <w:p/>
-    <w:p>
-      <w:pPr>
-        <w:rPr>
-          <w:b/>
-          <w:bCs/>
-        </w:rPr>
-      </w:pPr>
-      <w:r>
-        <w:rPr>
-          <w:b/>
-          <w:bCs/>
-        </w:rPr>
+    <w:p>
+      <w:pPr>
+        <w:rPr>
+          <w:b/>
+          <w:bCs/>
+        </w:rPr>
+      </w:pPr>
+      <w:r>
+        <w:rPr>
+          <w:b/>
+          <w:bCs/>
+        </w:rPr>
+        <w:lastRenderedPageBreak/>
         <w:t>Here's the approach I recommend</w:t>
       </w:r>
     </w:p>
@@ -6924,7 +6554,9 @@
     </w:p>
     <w:p>
       <w:r>
-        <w:lastRenderedPageBreak/>
+        <w:rPr>
+          <w:noProof/>
+        </w:rPr>
         <w:drawing>
           <wp:inline distT="0" distB="0" distL="0" distR="0" wp14:anchorId="030B40E1" wp14:editId="4854A6B0">
             <wp:extent cx="6645910" cy="3035300"/>
@@ -6941,7 +6573,7 @@
                     <pic:cNvPicPr/>
                   </pic:nvPicPr>
                   <pic:blipFill>
-                    <a:blip r:embed="rId23"/>
+                    <a:blip r:embed="rId24"/>
                     <a:stretch>
                       <a:fillRect/>
                     </a:stretch>
@@ -6982,6 +6614,9 @@
     </w:p>
     <w:p>
       <w:r>
+        <w:rPr>
+          <w:noProof/>
+        </w:rPr>
         <w:drawing>
           <wp:inline distT="0" distB="0" distL="0" distR="0" wp14:anchorId="4C663C43" wp14:editId="0922C17E">
             <wp:extent cx="4801270" cy="1762371"/>
@@ -6998,7 +6633,7 @@
                     <pic:cNvPicPr/>
                   </pic:nvPicPr>
                   <pic:blipFill>
-                    <a:blip r:embed="rId24"/>
+                    <a:blip r:embed="rId25"/>
                     <a:stretch>
                       <a:fillRect/>
                     </a:stretch>
@@ -7125,6 +6760,7 @@
         <w:rPr>
           <w:rFonts w:ascii="Segoe UI Emoji" w:hAnsi="Segoe UI Emoji" w:cs="Segoe UI Emoji"/>
         </w:rPr>
+        <w:lastRenderedPageBreak/>
         <w:t>⬇️</w:t>
       </w:r>
     </w:p>
@@ -7167,7 +6803,6 @@
         </w:numPr>
       </w:pPr>
       <w:r>
-        <w:lastRenderedPageBreak/>
         <w:t xml:space="preserve">Explain constraints </w:t>
       </w:r>
     </w:p>
@@ -7226,6 +6861,9 @@
         <w:ind w:left="720"/>
       </w:pPr>
       <w:r>
+        <w:rPr>
+          <w:noProof/>
+        </w:rPr>
         <w:drawing>
           <wp:inline distT="0" distB="0" distL="0" distR="0" wp14:anchorId="69F5387A" wp14:editId="7F849162">
             <wp:extent cx="3715268" cy="1552792"/>
@@ -7242,7 +6880,7 @@
                     <pic:cNvPicPr/>
                   </pic:nvPicPr>
                   <pic:blipFill>
-                    <a:blip r:embed="rId25"/>
+                    <a:blip r:embed="rId26"/>
                     <a:stretch>
                       <a:fillRect/>
                     </a:stretch>
@@ -7410,6 +7048,7 @@
           <w:b/>
           <w:bCs/>
         </w:rPr>
+        <w:lastRenderedPageBreak/>
         <w:t>Step 8</w:t>
       </w:r>
     </w:p>
@@ -7449,7 +7088,6 @@
         </w:numPr>
       </w:pPr>
       <w:r>
-        <w:lastRenderedPageBreak/>
         <w:t xml:space="preserve">Create token entities </w:t>
       </w:r>
     </w:p>
@@ -7589,13 +7227,8 @@
           <w:numId w:val="37"/>
         </w:numPr>
       </w:pPr>
-      <w:proofErr w:type="spellStart"/>
-      <w:r>
-        <w:t>BCrypt</w:t>
-      </w:r>
-      <w:proofErr w:type="spellEnd"/>
-      <w:r>
-        <w:t xml:space="preserve"> configuration </w:t>
+      <w:r>
+        <w:t xml:space="preserve">BCrypt configuration </w:t>
       </w:r>
     </w:p>
     <w:p>
@@ -14361,6 +13994,7 @@
   <w:style w:type="character" w:default="1" w:styleId="DefaultParagraphFont">
     <w:name w:val="Default Paragraph Font"/>
     <w:uiPriority w:val="1"/>
+    <w:semiHidden/>
     <w:unhideWhenUsed/>
   </w:style>
   <w:style w:type="table" w:default="1" w:styleId="TableNormal">

</xml_diff>

<commit_message>
Date: 21.06.2026 – Phase 2: Domain Entities & Database Schema
</commit_message>
<xml_diff>
--- a/DOCUMENTS/Project Development Journey.docx
+++ b/DOCUMENTS/Project Development Journey.docx
@@ -106,7 +106,15 @@
     </w:p>
     <w:p>
       <w:r>
-        <w:t>Created the main project folder ProcessMind-AI with these directories:</w:t>
+        <w:t>Created the main project folder </w:t>
+      </w:r>
+      <w:proofErr w:type="spellStart"/>
+      <w:r>
+        <w:t>ProcessMind</w:t>
+      </w:r>
+      <w:proofErr w:type="spellEnd"/>
+      <w:r>
+        <w:t>-AI with these directories:</w:t>
       </w:r>
     </w:p>
     <w:p>
@@ -115,8 +123,13 @@
       </w:r>
     </w:p>
     <w:p>
-      <w:r>
-        <w:t>ProcessMind-AI/</w:t>
+      <w:proofErr w:type="spellStart"/>
+      <w:r>
+        <w:t>ProcessMind</w:t>
+      </w:r>
+      <w:proofErr w:type="spellEnd"/>
+      <w:r>
+        <w:t>-AI/</w:t>
       </w:r>
     </w:p>
     <w:p>
@@ -275,8 +288,18 @@
             <w:b/>
             <w:bCs/>
           </w:rPr>
-          <w:t>Spring Initializr</w:t>
+          <w:t xml:space="preserve">Spring </w:t>
         </w:r>
+        <w:proofErr w:type="spellStart"/>
+        <w:r>
+          <w:rPr>
+            <w:rStyle w:val="Hyperlink"/>
+            <w:b/>
+            <w:bCs/>
+          </w:rPr>
+          <w:t>Initializr</w:t>
+        </w:r>
+        <w:proofErr w:type="spellEnd"/>
       </w:hyperlink>
       <w:r>
         <w:t> to generate the project</w:t>
@@ -340,10 +363,12 @@
       <w:r>
         <w:t>Group: </w:t>
       </w:r>
+      <w:proofErr w:type="spellStart"/>
       <w:proofErr w:type="gramStart"/>
       <w:r>
         <w:t>com.processmind</w:t>
       </w:r>
+      <w:proofErr w:type="spellEnd"/>
       <w:proofErr w:type="gramEnd"/>
     </w:p>
     <w:p>
@@ -354,8 +379,13 @@
         </w:numPr>
       </w:pPr>
       <w:r>
-        <w:t>Artifact: processmind-api</w:t>
-      </w:r>
+        <w:t>Artifact: </w:t>
+      </w:r>
+      <w:proofErr w:type="spellStart"/>
+      <w:r>
+        <w:t>processmind-api</w:t>
+      </w:r>
+      <w:proofErr w:type="spellEnd"/>
     </w:p>
     <w:p>
       <w:pPr>
@@ -365,7 +395,15 @@
         </w:numPr>
       </w:pPr>
       <w:r>
-        <w:t>Name: ProcessMind API</w:t>
+        <w:t>Name: </w:t>
+      </w:r>
+      <w:proofErr w:type="spellStart"/>
+      <w:r>
+        <w:t>ProcessMind</w:t>
+      </w:r>
+      <w:proofErr w:type="spellEnd"/>
+      <w:r>
+        <w:t xml:space="preserve"> API</w:t>
       </w:r>
     </w:p>
     <w:p>
@@ -378,10 +416,12 @@
       <w:r>
         <w:t>Package: </w:t>
       </w:r>
+      <w:proofErr w:type="spellStart"/>
       <w:proofErr w:type="gramStart"/>
       <w:r>
         <w:t>com.processmind</w:t>
       </w:r>
+      <w:proofErr w:type="spellEnd"/>
       <w:proofErr w:type="gramEnd"/>
     </w:p>
     <w:p>
@@ -664,9 +704,19 @@
               <w:spacing w:after="160" w:line="278" w:lineRule="auto"/>
               <w:cnfStyle w:val="000000000000" w:firstRow="0" w:lastRow="0" w:firstColumn="0" w:lastColumn="0" w:oddVBand="0" w:evenVBand="0" w:oddHBand="0" w:evenHBand="0" w:firstRowFirstColumn="0" w:firstRowLastColumn="0" w:lastRowFirstColumn="0" w:lastRowLastColumn="0"/>
             </w:pPr>
-            <w:r>
-              <w:t>SpringDoc OpenAPI</w:t>
-            </w:r>
+            <w:proofErr w:type="spellStart"/>
+            <w:r>
+              <w:t>SpringDoc</w:t>
+            </w:r>
+            <w:proofErr w:type="spellEnd"/>
+            <w:r>
+              <w:t xml:space="preserve"> </w:t>
+            </w:r>
+            <w:proofErr w:type="spellStart"/>
+            <w:r>
+              <w:t>OpenAPI</w:t>
+            </w:r>
+            <w:proofErr w:type="spellEnd"/>
           </w:p>
         </w:tc>
       </w:tr>
@@ -719,14 +769,26 @@
       <w:r>
         <w:t>Downloaded PostgreSQL 17 from </w:t>
       </w:r>
-      <w:hyperlink r:id="rId6" w:tgtFrame="_blank" w:history="1">
-        <w:r>
-          <w:rPr>
-            <w:rStyle w:val="Hyperlink"/>
-          </w:rPr>
-          <w:t>EnterpriseDB</w:t>
-        </w:r>
-      </w:hyperlink>
+      <w:proofErr w:type="spellStart"/>
+      <w:r>
+        <w:fldChar w:fldCharType="begin"/>
+      </w:r>
+      <w:r>
+        <w:instrText>HYPERLINK "https://www.enterprisedb.com/downloads/postgres-postgresql-downloads" \t "_blank"</w:instrText>
+      </w:r>
+      <w:r>
+        <w:fldChar w:fldCharType="separate"/>
+      </w:r>
+      <w:r>
+        <w:rPr>
+          <w:rStyle w:val="Hyperlink"/>
+        </w:rPr>
+        <w:t>EnterpriseDB</w:t>
+      </w:r>
+      <w:proofErr w:type="spellEnd"/>
+      <w:r>
+        <w:fldChar w:fldCharType="end"/>
+      </w:r>
     </w:p>
     <w:p>
       <w:pPr>
@@ -751,8 +813,13 @@
         </w:numPr>
       </w:pPr>
       <w:r>
-        <w:t>Username: postgres</w:t>
-      </w:r>
+        <w:t>Username: </w:t>
+      </w:r>
+      <w:proofErr w:type="spellStart"/>
+      <w:r>
+        <w:t>postgres</w:t>
+      </w:r>
+      <w:proofErr w:type="spellEnd"/>
     </w:p>
     <w:p>
       <w:pPr>
@@ -788,8 +855,17 @@
           <w:b/>
           <w:bCs/>
         </w:rPr>
-        <w:t>5. Installed pgAdmin</w:t>
-      </w:r>
+        <w:t xml:space="preserve">5. Installed </w:t>
+      </w:r>
+      <w:proofErr w:type="spellStart"/>
+      <w:r>
+        <w:rPr>
+          <w:b/>
+          <w:bCs/>
+        </w:rPr>
+        <w:t>pgAdmin</w:t>
+      </w:r>
+      <w:proofErr w:type="spellEnd"/>
     </w:p>
     <w:p>
       <w:pPr>
@@ -836,8 +912,21 @@
         </w:numPr>
       </w:pPr>
       <w:r>
-        <w:t>Created processmind_db database in pgAdmin</w:t>
-      </w:r>
+        <w:t>Created </w:t>
+      </w:r>
+      <w:proofErr w:type="spellStart"/>
+      <w:r>
+        <w:t>processmind_db</w:t>
+      </w:r>
+      <w:proofErr w:type="spellEnd"/>
+      <w:r>
+        <w:t xml:space="preserve"> database in </w:t>
+      </w:r>
+      <w:proofErr w:type="spellStart"/>
+      <w:r>
+        <w:t>pgAdmin</w:t>
+      </w:r>
+      <w:proofErr w:type="spellEnd"/>
     </w:p>
     <w:p>
       <w:pPr>
@@ -904,7 +993,7 @@
                     <pic:cNvPicPr/>
                   </pic:nvPicPr>
                   <pic:blipFill>
-                    <a:blip r:embed="rId7"/>
+                    <a:blip r:embed="rId6"/>
                     <a:stretch>
                       <a:fillRect/>
                     </a:stretch>
@@ -961,8 +1050,21 @@
       </w:r>
     </w:p>
     <w:p>
-      <w:r>
-        <w:t>src/main/java/com/processmind/</w:t>
+      <w:proofErr w:type="spellStart"/>
+      <w:r>
+        <w:t>src</w:t>
+      </w:r>
+      <w:proofErr w:type="spellEnd"/>
+      <w:r>
+        <w:t>/main/java/com/</w:t>
+      </w:r>
+      <w:proofErr w:type="spellStart"/>
+      <w:r>
+        <w:t>processmind</w:t>
+      </w:r>
+      <w:proofErr w:type="spellEnd"/>
+      <w:r>
+        <w:t>/</w:t>
       </w:r>
     </w:p>
     <w:p>
@@ -1056,7 +1158,15 @@
         <w:t>──</w:t>
       </w:r>
       <w:r>
-        <w:t xml:space="preserve"> dto/</w:t>
+        <w:t xml:space="preserve"> </w:t>
+      </w:r>
+      <w:proofErr w:type="spellStart"/>
+      <w:r>
+        <w:t>dto</w:t>
+      </w:r>
+      <w:proofErr w:type="spellEnd"/>
+      <w:r>
+        <w:t>/</w:t>
       </w:r>
     </w:p>
     <w:p>
@@ -1076,7 +1186,15 @@
         <w:t>──</w:t>
       </w:r>
       <w:r>
-        <w:t xml:space="preserve"> enums/</w:t>
+        <w:t xml:space="preserve"> </w:t>
+      </w:r>
+      <w:proofErr w:type="spellStart"/>
+      <w:r>
+        <w:t>enums</w:t>
+      </w:r>
+      <w:proofErr w:type="spellEnd"/>
+      <w:r>
+        <w:t>/</w:t>
       </w:r>
     </w:p>
     <w:p>
@@ -1425,8 +1543,13 @@
           <w:numId w:val="5"/>
         </w:numPr>
       </w:pPr>
-      <w:r>
-        <w:t>dto/</w:t>
+      <w:proofErr w:type="spellStart"/>
+      <w:r>
+        <w:t>dto</w:t>
+      </w:r>
+      <w:proofErr w:type="spellEnd"/>
+      <w:r>
+        <w:t>/</w:t>
       </w:r>
     </w:p>
     <w:p>
@@ -1499,8 +1622,13 @@
       </w:r>
     </w:p>
     <w:p>
-      <w:r>
-        <w:t>src/main/resources/</w:t>
+      <w:proofErr w:type="spellStart"/>
+      <w:r>
+        <w:t>src</w:t>
+      </w:r>
+      <w:proofErr w:type="spellEnd"/>
+      <w:r>
+        <w:t>/main/resources/</w:t>
       </w:r>
     </w:p>
     <w:p>
@@ -1517,7 +1645,15 @@
         <w:t>──</w:t>
       </w:r>
       <w:r>
-        <w:t xml:space="preserve"> application.yml       </w:t>
+        <w:t xml:space="preserve"> </w:t>
+      </w:r>
+      <w:proofErr w:type="spellStart"/>
+      <w:r>
+        <w:t>application.yml</w:t>
+      </w:r>
+      <w:proofErr w:type="spellEnd"/>
+      <w:r>
+        <w:t xml:space="preserve">       </w:t>
       </w:r>
       <w:proofErr w:type="gramStart"/>
       <w:r>
@@ -1542,7 +1678,15 @@
         <w:t>──</w:t>
       </w:r>
       <w:r>
-        <w:t xml:space="preserve"> application-dev.yml   </w:t>
+        <w:t xml:space="preserve"> application-</w:t>
+      </w:r>
+      <w:proofErr w:type="spellStart"/>
+      <w:r>
+        <w:t>dev.yml</w:t>
+      </w:r>
+      <w:proofErr w:type="spellEnd"/>
+      <w:r>
+        <w:t xml:space="preserve">   </w:t>
       </w:r>
       <w:proofErr w:type="gramStart"/>
       <w:r>
@@ -1567,7 +1711,15 @@
         <w:t>──</w:t>
       </w:r>
       <w:r>
-        <w:t xml:space="preserve"> application-prod.yml  </w:t>
+        <w:t xml:space="preserve"> application-</w:t>
+      </w:r>
+      <w:proofErr w:type="spellStart"/>
+      <w:r>
+        <w:t>prod.yml</w:t>
+      </w:r>
+      <w:proofErr w:type="spellEnd"/>
+      <w:r>
+        <w:t xml:space="preserve">  </w:t>
       </w:r>
       <w:proofErr w:type="gramStart"/>
       <w:r>
@@ -1592,7 +1744,15 @@
         <w:t>──</w:t>
       </w:r>
       <w:r>
-        <w:t xml:space="preserve"> db/</w:t>
+        <w:t xml:space="preserve"> </w:t>
+      </w:r>
+      <w:proofErr w:type="spellStart"/>
+      <w:r>
+        <w:t>db</w:t>
+      </w:r>
+      <w:proofErr w:type="spellEnd"/>
+      <w:r>
+        <w:t>/</w:t>
       </w:r>
     </w:p>
     <w:p>
@@ -1665,7 +1825,7 @@
                     <pic:cNvPicPr/>
                   </pic:nvPicPr>
                   <pic:blipFill>
-                    <a:blip r:embed="rId8"/>
+                    <a:blip r:embed="rId7"/>
                     <a:stretch>
                       <a:fillRect/>
                     </a:stretch>
@@ -1735,7 +1895,15 @@
         </w:numPr>
       </w:pPr>
       <w:r>
-        <w:t>Content: CREATE SCHEMA IF NOT EXISTS processmind;</w:t>
+        <w:t xml:space="preserve">Content: CREATE SCHEMA IF NOT EXISTS </w:t>
+      </w:r>
+      <w:proofErr w:type="spellStart"/>
+      <w:r>
+        <w:t>processmind</w:t>
+      </w:r>
+      <w:proofErr w:type="spellEnd"/>
+      <w:r>
+        <w:t>;</w:t>
       </w:r>
     </w:p>
     <w:p>
@@ -1777,8 +1945,17 @@
           <w:b/>
           <w:bCs/>
         </w:rPr>
-        <w:t>12. Created HealthController</w:t>
-      </w:r>
+        <w:t xml:space="preserve">12. Created </w:t>
+      </w:r>
+      <w:proofErr w:type="spellStart"/>
+      <w:r>
+        <w:rPr>
+          <w:b/>
+          <w:bCs/>
+        </w:rPr>
+        <w:t>HealthController</w:t>
+      </w:r>
+      <w:proofErr w:type="spellEnd"/>
     </w:p>
     <w:p>
       <w:r>
@@ -1802,7 +1979,7 @@
                     <pic:cNvPicPr/>
                   </pic:nvPicPr>
                   <pic:blipFill>
-                    <a:blip r:embed="rId9"/>
+                    <a:blip r:embed="rId8"/>
                     <a:stretch>
                       <a:fillRect/>
                     </a:stretch>
@@ -1835,8 +2012,17 @@
           <w:b/>
           <w:bCs/>
         </w:rPr>
-        <w:t>13. Created SecurityConfig</w:t>
-      </w:r>
+        <w:t xml:space="preserve">13. Created </w:t>
+      </w:r>
+      <w:proofErr w:type="spellStart"/>
+      <w:r>
+        <w:rPr>
+          <w:b/>
+          <w:bCs/>
+        </w:rPr>
+        <w:t>SecurityConfig</w:t>
+      </w:r>
+      <w:proofErr w:type="spellEnd"/>
     </w:p>
     <w:p>
       <w:pPr>
@@ -1865,7 +2051,7 @@
                     <pic:cNvPicPr/>
                   </pic:nvPicPr>
                   <pic:blipFill>
-                    <a:blip r:embed="rId10"/>
+                    <a:blip r:embed="rId9"/>
                     <a:stretch>
                       <a:fillRect/>
                     </a:stretch>
@@ -1939,16 +2125,34 @@
       <w:r>
         <w:t>Command: </w:t>
       </w:r>
-      <w:r>
-        <w:t>mvn clean spring-</w:t>
+      <w:proofErr w:type="spellStart"/>
+      <w:r>
+        <w:t>mvn</w:t>
+      </w:r>
+      <w:proofErr w:type="spellEnd"/>
+      <w:r>
+        <w:t xml:space="preserve"> clean </w:t>
+      </w:r>
+      <w:proofErr w:type="spellStart"/>
+      <w:r>
+        <w:t>spring-</w:t>
       </w:r>
       <w:proofErr w:type="gramStart"/>
       <w:r>
         <w:t>boot:run</w:t>
       </w:r>
+      <w:proofErr w:type="spellEnd"/>
       <w:proofErr w:type="gramEnd"/>
       <w:r>
-        <w:t xml:space="preserve"> "-Dspring-boot.run.profiles=dev"</w:t>
+        <w:t xml:space="preserve"> "-</w:t>
+      </w:r>
+      <w:proofErr w:type="spellStart"/>
+      <w:r>
+        <w:t>Dspring-boot.run.profiles</w:t>
+      </w:r>
+      <w:proofErr w:type="spellEnd"/>
+      <w:r>
+        <w:t>=dev"</w:t>
       </w:r>
     </w:p>
     <w:p>
@@ -2102,8 +2306,13 @@
               <w:spacing w:after="160" w:line="278" w:lineRule="auto"/>
               <w:cnfStyle w:val="000000100000" w:firstRow="0" w:lastRow="0" w:firstColumn="0" w:lastColumn="0" w:oddVBand="0" w:evenVBand="0" w:oddHBand="1" w:evenHBand="0" w:firstRowFirstColumn="0" w:firstRowLastColumn="0" w:lastRowFirstColumn="0" w:lastRowLastColumn="0"/>
             </w:pPr>
-            <w:r>
-              <w:t>ProcessMind API is running</w:t>
+            <w:proofErr w:type="spellStart"/>
+            <w:r>
+              <w:t>ProcessMind</w:t>
+            </w:r>
+            <w:proofErr w:type="spellEnd"/>
+            <w:r>
+              <w:t xml:space="preserve"> API is running</w:t>
             </w:r>
           </w:p>
         </w:tc>
@@ -2216,7 +2425,15 @@
               <w:cnfStyle w:val="000000100000" w:firstRow="0" w:lastRow="0" w:firstColumn="0" w:lastColumn="0" w:oddVBand="0" w:evenVBand="0" w:oddHBand="1" w:evenHBand="0" w:firstRowFirstColumn="0" w:firstRowLastColumn="0" w:lastRowFirstColumn="0" w:lastRowLastColumn="0"/>
             </w:pPr>
             <w:r>
-              <w:t>{"status":"UP"}</w:t>
+              <w:t>{"</w:t>
+            </w:r>
+            <w:proofErr w:type="spellStart"/>
+            <w:r>
+              <w:t>status":"UP</w:t>
+            </w:r>
+            <w:proofErr w:type="spellEnd"/>
+            <w:r>
+              <w:t>"}</w:t>
             </w:r>
           </w:p>
         </w:tc>
@@ -2260,7 +2477,15 @@
         <w:t>✅</w:t>
       </w:r>
       <w:r>
-        <w:t xml:space="preserve"> HikariCP connection pool started</w:t>
+        <w:t xml:space="preserve"> </w:t>
+      </w:r>
+      <w:proofErr w:type="spellStart"/>
+      <w:r>
+        <w:t>HikariCP</w:t>
+      </w:r>
+      <w:proofErr w:type="spellEnd"/>
+      <w:r>
+        <w:t xml:space="preserve"> connection pool started</w:t>
       </w:r>
     </w:p>
     <w:p>
@@ -2745,9 +2970,19 @@
             <w:pPr>
               <w:spacing w:after="160" w:line="278" w:lineRule="auto"/>
             </w:pPr>
-            <w:r>
-              <w:t>SpringDoc OpenAPI</w:t>
-            </w:r>
+            <w:proofErr w:type="spellStart"/>
+            <w:r>
+              <w:t>SpringDoc</w:t>
+            </w:r>
+            <w:proofErr w:type="spellEnd"/>
+            <w:r>
+              <w:t xml:space="preserve"> </w:t>
+            </w:r>
+            <w:proofErr w:type="spellStart"/>
+            <w:r>
+              <w:t>OpenAPI</w:t>
+            </w:r>
+            <w:proofErr w:type="spellEnd"/>
           </w:p>
         </w:tc>
         <w:tc>
@@ -3088,7 +3323,7 @@
                     <pic:cNvPicPr/>
                   </pic:nvPicPr>
                   <pic:blipFill>
-                    <a:blip r:embed="rId11"/>
+                    <a:blip r:embed="rId10"/>
                     <a:stretch>
                       <a:fillRect/>
                     </a:stretch>
@@ -3670,7 +3905,7 @@
                     <pic:cNvPicPr/>
                   </pic:nvPicPr>
                   <pic:blipFill>
-                    <a:blip r:embed="rId12"/>
+                    <a:blip r:embed="rId11"/>
                     <a:stretch>
                       <a:fillRect/>
                     </a:stretch>
@@ -3908,9 +4143,11 @@
             <w:pPr>
               <w:spacing w:after="160" w:line="278" w:lineRule="auto"/>
             </w:pPr>
+            <w:proofErr w:type="spellStart"/>
             <w:r>
               <w:t>MethodArgumentNotValidException</w:t>
             </w:r>
+            <w:proofErr w:type="spellEnd"/>
           </w:p>
         </w:tc>
         <w:tc>
@@ -3958,9 +4195,11 @@
             <w:pPr>
               <w:spacing w:after="160" w:line="278" w:lineRule="auto"/>
             </w:pPr>
+            <w:proofErr w:type="spellStart"/>
             <w:r>
               <w:t>AccessDeniedException</w:t>
             </w:r>
+            <w:proofErr w:type="spellEnd"/>
           </w:p>
         </w:tc>
         <w:tc>
@@ -4009,9 +4248,11 @@
             <w:pPr>
               <w:spacing w:after="160" w:line="278" w:lineRule="auto"/>
             </w:pPr>
+            <w:proofErr w:type="spellStart"/>
             <w:r>
               <w:t>NoHandlerFoundException</w:t>
             </w:r>
+            <w:proofErr w:type="spellEnd"/>
           </w:p>
         </w:tc>
         <w:tc>
@@ -4178,7 +4419,15 @@
         </w:numPr>
       </w:pPr>
       <w:r>
-        <w:t>Extends RuntimeException (unchecked)</w:t>
+        <w:t xml:space="preserve">Extends </w:t>
+      </w:r>
+      <w:proofErr w:type="spellStart"/>
+      <w:r>
+        <w:t>RuntimeException</w:t>
+      </w:r>
+      <w:proofErr w:type="spellEnd"/>
+      <w:r>
+        <w:t xml:space="preserve"> (unchecked)</w:t>
       </w:r>
     </w:p>
     <w:p>
@@ -4211,7 +4460,7 @@
                     <pic:cNvPicPr/>
                   </pic:nvPicPr>
                   <pic:blipFill>
-                    <a:blip r:embed="rId13"/>
+                    <a:blip r:embed="rId12"/>
                     <a:stretch>
                       <a:fillRect/>
                     </a:stretch>
@@ -4290,7 +4539,15 @@
         </w:numPr>
       </w:pPr>
       <w:r>
-        <w:t>Uses ApiResponse wrapper</w:t>
+        <w:t>Uses </w:t>
+      </w:r>
+      <w:proofErr w:type="spellStart"/>
+      <w:r>
+        <w:t>ApiResponse</w:t>
+      </w:r>
+      <w:proofErr w:type="spellEnd"/>
+      <w:r>
+        <w:t> wrapper</w:t>
       </w:r>
     </w:p>
     <w:p>
@@ -4346,7 +4603,7 @@
                     <pic:cNvPicPr/>
                   </pic:nvPicPr>
                   <pic:blipFill>
-                    <a:blip r:embed="rId14"/>
+                    <a:blip r:embed="rId13"/>
                     <a:stretch>
                       <a:fillRect/>
                     </a:stretch>
@@ -4391,7 +4648,15 @@
         <w:t>Location:</w:t>
       </w:r>
       <w:r>
-        <w:t> src/main/resources/logback-spring.xml</w:t>
+        <w:t> </w:t>
+      </w:r>
+      <w:proofErr w:type="spellStart"/>
+      <w:r>
+        <w:t>src</w:t>
+      </w:r>
+      <w:proofErr w:type="spellEnd"/>
+      <w:r>
+        <w:t>/main/resources/logback-spring.xml</w:t>
       </w:r>
     </w:p>
     <w:p>
@@ -4474,10 +4739,12 @@
           <w:numId w:val="18"/>
         </w:numPr>
       </w:pPr>
+      <w:proofErr w:type="spellStart"/>
       <w:proofErr w:type="gramStart"/>
       <w:r>
         <w:t>com.processmind</w:t>
       </w:r>
+      <w:proofErr w:type="spellEnd"/>
       <w:proofErr w:type="gramEnd"/>
       <w:r>
         <w:t>: DEBUG</w:t>
@@ -4490,8 +4757,13 @@
           <w:numId w:val="18"/>
         </w:numPr>
       </w:pPr>
-      <w:r>
-        <w:t>org.springframework.web: DEBUG</w:t>
+      <w:proofErr w:type="spellStart"/>
+      <w:r>
+        <w:t>org.springframework.web</w:t>
+      </w:r>
+      <w:proofErr w:type="spellEnd"/>
+      <w:r>
+        <w:t>: DEBUG</w:t>
       </w:r>
     </w:p>
     <w:p>
@@ -4501,8 +4773,13 @@
           <w:numId w:val="18"/>
         </w:numPr>
       </w:pPr>
-      <w:r>
-        <w:t>org.hibernate.SQL: DEBUG</w:t>
+      <w:proofErr w:type="spellStart"/>
+      <w:r>
+        <w:t>org.hibernate.SQL</w:t>
+      </w:r>
+      <w:proofErr w:type="spellEnd"/>
+      <w:r>
+        <w:t>: DEBUG</w:t>
       </w:r>
     </w:p>
     <w:p>
@@ -4552,9 +4829,19 @@
           <w:numId w:val="19"/>
         </w:numPr>
       </w:pPr>
-      <w:r>
-        <w:t>src/main/resources/application.yml</w:t>
-      </w:r>
+      <w:proofErr w:type="spellStart"/>
+      <w:r>
+        <w:t>src</w:t>
+      </w:r>
+      <w:proofErr w:type="spellEnd"/>
+      <w:r>
+        <w:t>/main/resources/</w:t>
+      </w:r>
+      <w:proofErr w:type="spellStart"/>
+      <w:r>
+        <w:t>application.yml</w:t>
+      </w:r>
+      <w:proofErr w:type="spellEnd"/>
     </w:p>
     <w:p>
       <w:pPr>
@@ -4563,9 +4850,19 @@
           <w:numId w:val="19"/>
         </w:numPr>
       </w:pPr>
-      <w:r>
-        <w:t>src/main/resources/application-dev.yml</w:t>
-      </w:r>
+      <w:proofErr w:type="spellStart"/>
+      <w:r>
+        <w:t>src</w:t>
+      </w:r>
+      <w:proofErr w:type="spellEnd"/>
+      <w:r>
+        <w:t>/main/resources/application-</w:t>
+      </w:r>
+      <w:proofErr w:type="spellStart"/>
+      <w:r>
+        <w:t>dev.yml</w:t>
+      </w:r>
+      <w:proofErr w:type="spellEnd"/>
     </w:p>
     <w:p>
       <w:pPr>
@@ -4574,9 +4871,19 @@
           <w:numId w:val="19"/>
         </w:numPr>
       </w:pPr>
-      <w:r>
-        <w:t>src/main/resources/application-prod.yml</w:t>
-      </w:r>
+      <w:proofErr w:type="spellStart"/>
+      <w:r>
+        <w:t>src</w:t>
+      </w:r>
+      <w:proofErr w:type="spellEnd"/>
+      <w:r>
+        <w:t>/main/resources/application-</w:t>
+      </w:r>
+      <w:proofErr w:type="spellStart"/>
+      <w:r>
+        <w:t>prod.yml</w:t>
+      </w:r>
+      <w:proofErr w:type="spellEnd"/>
     </w:p>
     <w:p>
       <w:pPr>
@@ -4678,7 +4985,7 @@
                     <pic:cNvPicPr/>
                   </pic:nvPicPr>
                   <pic:blipFill>
-                    <a:blip r:embed="rId15"/>
+                    <a:blip r:embed="rId14"/>
                     <a:stretch>
                       <a:fillRect/>
                     </a:stretch>
@@ -5030,8 +5337,13 @@
         </w:numPr>
       </w:pPr>
       <w:r>
-        <w:t>backend/Dockerfile</w:t>
-      </w:r>
+        <w:t>backend/</w:t>
+      </w:r>
+      <w:proofErr w:type="spellStart"/>
+      <w:r>
+        <w:t>Dockerfile</w:t>
+      </w:r>
+      <w:proofErr w:type="spellEnd"/>
     </w:p>
     <w:p>
       <w:pPr>
@@ -5041,8 +5353,13 @@
         </w:numPr>
       </w:pPr>
       <w:r>
-        <w:t>docker/docker-compose.yml</w:t>
-      </w:r>
+        <w:t>docker/docker-</w:t>
+      </w:r>
+      <w:proofErr w:type="spellStart"/>
+      <w:r>
+        <w:t>compose.yml</w:t>
+      </w:r>
+      <w:proofErr w:type="spellEnd"/>
     </w:p>
     <w:p>
       <w:pPr>
@@ -5051,9 +5368,19 @@
           <w:numId w:val="22"/>
         </w:numPr>
       </w:pPr>
-      <w:r>
-        <w:t>ProcessMind-AI/docker-compose.yml</w:t>
-      </w:r>
+      <w:proofErr w:type="spellStart"/>
+      <w:r>
+        <w:t>ProcessMind</w:t>
+      </w:r>
+      <w:proofErr w:type="spellEnd"/>
+      <w:r>
+        <w:t>-AI/docker-</w:t>
+      </w:r>
+      <w:proofErr w:type="spellStart"/>
+      <w:r>
+        <w:t>compose.yml</w:t>
+      </w:r>
+      <w:proofErr w:type="spellEnd"/>
     </w:p>
     <w:p>
       <w:r>
@@ -5150,7 +5477,7 @@
                     <pic:cNvPicPr/>
                   </pic:nvPicPr>
                   <pic:blipFill>
-                    <a:blip r:embed="rId16"/>
+                    <a:blip r:embed="rId15"/>
                     <a:stretch>
                       <a:fillRect/>
                     </a:stretch>
@@ -5240,7 +5567,7 @@
                     <pic:cNvPicPr/>
                   </pic:nvPicPr>
                   <pic:blipFill>
-                    <a:blip r:embed="rId17"/>
+                    <a:blip r:embed="rId16"/>
                     <a:stretch>
                       <a:fillRect/>
                     </a:stretch>
@@ -5492,8 +5819,13 @@
               <w:cnfStyle w:val="000000000000" w:firstRow="0" w:lastRow="0" w:firstColumn="0" w:lastColumn="0" w:oddVBand="0" w:evenVBand="0" w:oddHBand="0" w:evenHBand="0" w:firstRowFirstColumn="0" w:firstRowLastColumn="0" w:lastRowFirstColumn="0" w:lastRowLastColumn="0"/>
             </w:pPr>
             <w:r>
-              <w:t>JSON response with ApiResponse</w:t>
-            </w:r>
+              <w:t xml:space="preserve">JSON response with </w:t>
+            </w:r>
+            <w:proofErr w:type="spellStart"/>
+            <w:r>
+              <w:t>ApiResponse</w:t>
+            </w:r>
+            <w:proofErr w:type="spellEnd"/>
           </w:p>
         </w:tc>
       </w:tr>
@@ -5854,7 +6186,7 @@
                     <pic:cNvPicPr/>
                   </pic:nvPicPr>
                   <pic:blipFill>
-                    <a:blip r:embed="rId18"/>
+                    <a:blip r:embed="rId17"/>
                     <a:stretch>
                       <a:fillRect/>
                     </a:stretch>
@@ -5937,7 +6269,7 @@
                     <pic:cNvPicPr/>
                   </pic:nvPicPr>
                   <pic:blipFill>
-                    <a:blip r:embed="rId19"/>
+                    <a:blip r:embed="rId18"/>
                     <a:stretch>
                       <a:fillRect/>
                     </a:stretch>
@@ -6000,7 +6332,7 @@
                     <pic:cNvPicPr/>
                   </pic:nvPicPr>
                   <pic:blipFill>
-                    <a:blip r:embed="rId20"/>
+                    <a:blip r:embed="rId19"/>
                     <a:stretch>
                       <a:fillRect/>
                     </a:stretch>
@@ -6057,7 +6389,7 @@
                     <pic:cNvPicPr/>
                   </pic:nvPicPr>
                   <pic:blipFill>
-                    <a:blip r:embed="rId21"/>
+                    <a:blip r:embed="rId20"/>
                     <a:stretch>
                       <a:fillRect/>
                     </a:stretch>
@@ -6143,7 +6475,15 @@
     </w:p>
     <w:p>
       <w:r>
-        <w:t>Build the complete identity and access management platform that provides secure authentication, authorization, and tenant isolation for the ProcessMind AI system.</w:t>
+        <w:t xml:space="preserve">Build the complete identity and access management platform that provides secure authentication, authorization, and tenant isolation for the </w:t>
+      </w:r>
+      <w:proofErr w:type="spellStart"/>
+      <w:r>
+        <w:t>ProcessMind</w:t>
+      </w:r>
+      <w:proofErr w:type="spellEnd"/>
+      <w:r>
+        <w:t xml:space="preserve"> AI system.</w:t>
       </w:r>
     </w:p>
     <w:p>
@@ -6426,7 +6766,7 @@
                     <pic:cNvPicPr/>
                   </pic:nvPicPr>
                   <pic:blipFill rotWithShape="1">
-                    <a:blip r:embed="rId22"/>
+                    <a:blip r:embed="rId21"/>
                     <a:srcRect t="14571"/>
                     <a:stretch>
                       <a:fillRect/>
@@ -6486,7 +6826,7 @@
                     <pic:cNvPicPr/>
                   </pic:nvPicPr>
                   <pic:blipFill>
-                    <a:blip r:embed="rId23"/>
+                    <a:blip r:embed="rId22"/>
                     <a:stretch>
                       <a:fillRect/>
                     </a:stretch>
@@ -6573,7 +6913,7 @@
                     <pic:cNvPicPr/>
                   </pic:nvPicPr>
                   <pic:blipFill>
-                    <a:blip r:embed="rId24"/>
+                    <a:blip r:embed="rId23"/>
                     <a:stretch>
                       <a:fillRect/>
                     </a:stretch>
@@ -6633,7 +6973,7 @@
                     <pic:cNvPicPr/>
                   </pic:nvPicPr>
                   <pic:blipFill>
-                    <a:blip r:embed="rId25"/>
+                    <a:blip r:embed="rId24"/>
                     <a:stretch>
                       <a:fillRect/>
                     </a:stretch>
@@ -6880,7 +7220,7 @@
                     <pic:cNvPicPr/>
                   </pic:nvPicPr>
                   <pic:blipFill>
-                    <a:blip r:embed="rId26"/>
+                    <a:blip r:embed="rId25"/>
                     <a:stretch>
                       <a:fillRect/>
                     </a:stretch>
@@ -6902,54 +7242,720 @@
       </w:r>
     </w:p>
     <w:p>
-      <w:pPr>
-        <w:ind w:left="720"/>
-      </w:pPr>
-    </w:p>
-    <w:p>
-      <w:pPr>
-        <w:ind w:left="720"/>
-      </w:pPr>
-    </w:p>
-    <w:p>
-      <w:pPr>
-        <w:ind w:left="720"/>
-        <w:rPr>
-          <w:b/>
-          <w:bCs/>
-          <w:color w:val="EE0000"/>
-          <w:sz w:val="50"/>
-          <w:szCs w:val="50"/>
-        </w:rPr>
-      </w:pPr>
-      <w:r>
-        <w:rPr>
-          <w:b/>
-          <w:bCs/>
-          <w:color w:val="EE0000"/>
-          <w:sz w:val="50"/>
-          <w:szCs w:val="50"/>
-        </w:rPr>
-        <w:t xml:space="preserve">To be Continued from </w:t>
+      <w:r>
+        <w:rPr>
+          <w:rFonts w:ascii="Segoe UI Emoji" w:hAnsi="Segoe UI Emoji" w:cs="Segoe UI Emoji"/>
+        </w:rPr>
+        <w:t>⬇️</w:t>
+      </w:r>
+    </w:p>
+    <w:p>
+      <w:r>
+        <w:rPr>
+          <w:b/>
+          <w:bCs/>
+        </w:rPr>
+        <w:t>Step 5</w:t>
+      </w:r>
+    </w:p>
+    <w:p>
+      <w:r>
+        <w:drawing>
+          <wp:inline distT="0" distB="0" distL="0" distR="0" wp14:anchorId="18A2BFCD" wp14:editId="766D42D1">
+            <wp:extent cx="5514109" cy="2164715"/>
+            <wp:effectExtent l="0" t="0" r="0" b="6985"/>
+            <wp:docPr id="219446691" name="Picture 1"/>
+            <wp:cNvGraphicFramePr>
+              <a:graphicFrameLocks xmlns:a="http://schemas.openxmlformats.org/drawingml/2006/main" noChangeAspect="1"/>
+            </wp:cNvGraphicFramePr>
+            <a:graphic xmlns:a="http://schemas.openxmlformats.org/drawingml/2006/main">
+              <a:graphicData uri="http://schemas.openxmlformats.org/drawingml/2006/picture">
+                <pic:pic xmlns:pic="http://schemas.openxmlformats.org/drawingml/2006/picture">
+                  <pic:nvPicPr>
+                    <pic:cNvPr id="219446691" name=""/>
+                    <pic:cNvPicPr/>
+                  </pic:nvPicPr>
+                  <pic:blipFill>
+                    <a:blip r:embed="rId26"/>
+                    <a:stretch>
+                      <a:fillRect/>
+                    </a:stretch>
+                  </pic:blipFill>
+                  <pic:spPr>
+                    <a:xfrm>
+                      <a:off x="0" y="0"/>
+                      <a:ext cx="5557426" cy="2181720"/>
+                    </a:xfrm>
+                    <a:prstGeom prst="rect">
+                      <a:avLst/>
+                    </a:prstGeom>
+                  </pic:spPr>
+                </pic:pic>
+              </a:graphicData>
+            </a:graphic>
+          </wp:inline>
+        </w:drawing>
+      </w:r>
+    </w:p>
+    <w:p>
+      <w:pPr>
+        <w:rPr>
+          <w:b/>
+          <w:bCs/>
+        </w:rPr>
+      </w:pPr>
+      <w:r>
+        <w:rPr>
+          <w:b/>
+          <w:bCs/>
+        </w:rPr>
+        <w:drawing>
+          <wp:inline distT="0" distB="0" distL="0" distR="0" wp14:anchorId="33889474" wp14:editId="70131716">
+            <wp:extent cx="5562600" cy="1875886"/>
+            <wp:effectExtent l="0" t="0" r="0" b="0"/>
+            <wp:docPr id="1835361199" name="Picture 1"/>
+            <wp:cNvGraphicFramePr>
+              <a:graphicFrameLocks xmlns:a="http://schemas.openxmlformats.org/drawingml/2006/main" noChangeAspect="1"/>
+            </wp:cNvGraphicFramePr>
+            <a:graphic xmlns:a="http://schemas.openxmlformats.org/drawingml/2006/main">
+              <a:graphicData uri="http://schemas.openxmlformats.org/drawingml/2006/picture">
+                <pic:pic xmlns:pic="http://schemas.openxmlformats.org/drawingml/2006/picture">
+                  <pic:nvPicPr>
+                    <pic:cNvPr id="1835361199" name=""/>
+                    <pic:cNvPicPr/>
+                  </pic:nvPicPr>
+                  <pic:blipFill>
+                    <a:blip r:embed="rId27"/>
+                    <a:stretch>
+                      <a:fillRect/>
+                    </a:stretch>
+                  </pic:blipFill>
+                  <pic:spPr>
+                    <a:xfrm>
+                      <a:off x="0" y="0"/>
+                      <a:ext cx="5616607" cy="1894099"/>
+                    </a:xfrm>
+                    <a:prstGeom prst="rect">
+                      <a:avLst/>
+                    </a:prstGeom>
+                  </pic:spPr>
+                </pic:pic>
+              </a:graphicData>
+            </a:graphic>
+          </wp:inline>
+        </w:drawing>
+      </w:r>
+    </w:p>
+    <w:tbl>
+      <w:tblPr>
+        <w:tblStyle w:val="PlainTable1"/>
+        <w:tblW w:w="0" w:type="auto"/>
+        <w:tblLook w:val="04A0" w:firstRow="1" w:lastRow="0" w:firstColumn="1" w:lastColumn="0" w:noHBand="0" w:noVBand="1"/>
+      </w:tblPr>
+      <w:tblGrid>
+        <w:gridCol w:w="2875"/>
+        <w:gridCol w:w="4659"/>
+      </w:tblGrid>
+      <w:tr>
+        <w:trPr>
+          <w:cnfStyle w:val="100000000000" w:firstRow="1" w:lastRow="0" w:firstColumn="0" w:lastColumn="0" w:oddVBand="0" w:evenVBand="0" w:oddHBand="0" w:evenHBand="0" w:firstRowFirstColumn="0" w:firstRowLastColumn="0" w:lastRowFirstColumn="0" w:lastRowLastColumn="0"/>
+        </w:trPr>
+        <w:tc>
+          <w:tcPr>
+            <w:cnfStyle w:val="001000000000" w:firstRow="0" w:lastRow="0" w:firstColumn="1" w:lastColumn="0" w:oddVBand="0" w:evenVBand="0" w:oddHBand="0" w:evenHBand="0" w:firstRowFirstColumn="0" w:firstRowLastColumn="0" w:lastRowFirstColumn="0" w:lastRowLastColumn="0"/>
+            <w:tcW w:w="2875" w:type="dxa"/>
+            <w:hideMark/>
+          </w:tcPr>
+          <w:p>
+            <w:pPr>
+              <w:spacing w:after="160" w:line="278" w:lineRule="auto"/>
+            </w:pPr>
+            <w:r>
+              <w:lastRenderedPageBreak/>
+              <w:t>Annotation</w:t>
+            </w:r>
+          </w:p>
+        </w:tc>
+        <w:tc>
+          <w:tcPr>
+            <w:tcW w:w="4659" w:type="dxa"/>
+            <w:hideMark/>
+          </w:tcPr>
+          <w:p>
+            <w:pPr>
+              <w:spacing w:after="160" w:line="278" w:lineRule="auto"/>
+              <w:cnfStyle w:val="100000000000" w:firstRow="1" w:lastRow="0" w:firstColumn="0" w:lastColumn="0" w:oddVBand="0" w:evenVBand="0" w:oddHBand="0" w:evenHBand="0" w:firstRowFirstColumn="0" w:firstRowLastColumn="0" w:lastRowFirstColumn="0" w:lastRowLastColumn="0"/>
+            </w:pPr>
+            <w:r>
+              <w:t>Purpose</w:t>
+            </w:r>
+          </w:p>
+        </w:tc>
+      </w:tr>
+      <w:tr>
+        <w:trPr>
+          <w:cnfStyle w:val="000000100000" w:firstRow="0" w:lastRow="0" w:firstColumn="0" w:lastColumn="0" w:oddVBand="0" w:evenVBand="0" w:oddHBand="1" w:evenHBand="0" w:firstRowFirstColumn="0" w:firstRowLastColumn="0" w:lastRowFirstColumn="0" w:lastRowLastColumn="0"/>
+        </w:trPr>
+        <w:tc>
+          <w:tcPr>
+            <w:cnfStyle w:val="001000000000" w:firstRow="0" w:lastRow="0" w:firstColumn="1" w:lastColumn="0" w:oddVBand="0" w:evenVBand="0" w:oddHBand="0" w:evenHBand="0" w:firstRowFirstColumn="0" w:firstRowLastColumn="0" w:lastRowFirstColumn="0" w:lastRowLastColumn="0"/>
+            <w:tcW w:w="2875" w:type="dxa"/>
+            <w:hideMark/>
+          </w:tcPr>
+          <w:p>
+            <w:pPr>
+              <w:spacing w:after="160" w:line="278" w:lineRule="auto"/>
+            </w:pPr>
+            <w:r>
+              <w:t>@ManyToOne</w:t>
+            </w:r>
+          </w:p>
+        </w:tc>
+        <w:tc>
+          <w:tcPr>
+            <w:tcW w:w="4659" w:type="dxa"/>
+            <w:hideMark/>
+          </w:tcPr>
+          <w:p>
+            <w:pPr>
+              <w:spacing w:after="160" w:line="278" w:lineRule="auto"/>
+              <w:cnfStyle w:val="000000100000" w:firstRow="0" w:lastRow="0" w:firstColumn="0" w:lastColumn="0" w:oddVBand="0" w:evenVBand="0" w:oddHBand="1" w:evenHBand="0" w:firstRowFirstColumn="0" w:firstRowLastColumn="0" w:lastRowFirstColumn="0" w:lastRowLastColumn="0"/>
+            </w:pPr>
+            <w:r>
+              <w:t>Many departments belong to one organization.</w:t>
+            </w:r>
+          </w:p>
+        </w:tc>
+      </w:tr>
+      <w:tr>
+        <w:tc>
+          <w:tcPr>
+            <w:cnfStyle w:val="001000000000" w:firstRow="0" w:lastRow="0" w:firstColumn="1" w:lastColumn="0" w:oddVBand="0" w:evenVBand="0" w:oddHBand="0" w:evenHBand="0" w:firstRowFirstColumn="0" w:firstRowLastColumn="0" w:lastRowFirstColumn="0" w:lastRowLastColumn="0"/>
+            <w:tcW w:w="2875" w:type="dxa"/>
+            <w:hideMark/>
+          </w:tcPr>
+          <w:p>
+            <w:pPr>
+              <w:spacing w:after="160" w:line="278" w:lineRule="auto"/>
+            </w:pPr>
+            <w:r>
+              <w:t>@JoinColumn</w:t>
+            </w:r>
+          </w:p>
+        </w:tc>
+        <w:tc>
+          <w:tcPr>
+            <w:tcW w:w="4659" w:type="dxa"/>
+            <w:hideMark/>
+          </w:tcPr>
+          <w:p>
+            <w:pPr>
+              <w:spacing w:after="160" w:line="278" w:lineRule="auto"/>
+              <w:cnfStyle w:val="000000000000" w:firstRow="0" w:lastRow="0" w:firstColumn="0" w:lastColumn="0" w:oddVBand="0" w:evenVBand="0" w:oddHBand="0" w:evenHBand="0" w:firstRowFirstColumn="0" w:firstRowLastColumn="0" w:lastRowFirstColumn="0" w:lastRowLastColumn="0"/>
+            </w:pPr>
+            <w:r>
+              <w:t>Specifies the foreign key column.</w:t>
+            </w:r>
+          </w:p>
+        </w:tc>
+      </w:tr>
+      <w:tr>
+        <w:trPr>
+          <w:cnfStyle w:val="000000100000" w:firstRow="0" w:lastRow="0" w:firstColumn="0" w:lastColumn="0" w:oddVBand="0" w:evenVBand="0" w:oddHBand="1" w:evenHBand="0" w:firstRowFirstColumn="0" w:firstRowLastColumn="0" w:lastRowFirstColumn="0" w:lastRowLastColumn="0"/>
+        </w:trPr>
+        <w:tc>
+          <w:tcPr>
+            <w:cnfStyle w:val="001000000000" w:firstRow="0" w:lastRow="0" w:firstColumn="1" w:lastColumn="0" w:oddVBand="0" w:evenVBand="0" w:oddHBand="0" w:evenHBand="0" w:firstRowFirstColumn="0" w:firstRowLastColumn="0" w:lastRowFirstColumn="0" w:lastRowLastColumn="0"/>
+            <w:tcW w:w="2875" w:type="dxa"/>
+            <w:hideMark/>
+          </w:tcPr>
+          <w:p>
+            <w:pPr>
+              <w:spacing w:after="160" w:line="278" w:lineRule="auto"/>
+            </w:pPr>
+            <w:r>
+              <w:t xml:space="preserve">fetch = </w:t>
+            </w:r>
+            <w:proofErr w:type="spellStart"/>
+            <w:r>
+              <w:t>FetchType.LAZY</w:t>
+            </w:r>
+            <w:proofErr w:type="spellEnd"/>
+          </w:p>
+        </w:tc>
+        <w:tc>
+          <w:tcPr>
+            <w:tcW w:w="4659" w:type="dxa"/>
+            <w:hideMark/>
+          </w:tcPr>
+          <w:p>
+            <w:pPr>
+              <w:spacing w:after="160" w:line="278" w:lineRule="auto"/>
+              <w:cnfStyle w:val="000000100000" w:firstRow="0" w:lastRow="0" w:firstColumn="0" w:lastColumn="0" w:oddVBand="0" w:evenVBand="0" w:oddHBand="1" w:evenHBand="0" w:firstRowFirstColumn="0" w:firstRowLastColumn="0" w:lastRowFirstColumn="0" w:lastRowLastColumn="0"/>
+            </w:pPr>
+            <w:r>
+              <w:t>Loads the related organization only when needed.</w:t>
+            </w:r>
+          </w:p>
+        </w:tc>
+      </w:tr>
+    </w:tbl>
+    <w:p>
+      <w:r>
+        <w:t xml:space="preserve"> </w:t>
+      </w:r>
+    </w:p>
+    <w:p>
+      <w:pPr>
+        <w:rPr>
+          <w:b/>
+          <w:bCs/>
+        </w:rPr>
+      </w:pPr>
+      <w:r>
+        <w:rPr>
+          <w:b/>
+          <w:bCs/>
+        </w:rPr>
+        <w:t>Flow</w:t>
+      </w:r>
+    </w:p>
+    <w:p>
+      <w:pPr>
+        <w:ind w:firstLine="720"/>
+      </w:pPr>
+      <w:r>
+        <w:t xml:space="preserve">Department Object → Organization Object → Hibernate → </w:t>
+      </w:r>
+      <w:proofErr w:type="spellStart"/>
+      <w:r>
+        <w:t>organization_id</w:t>
+      </w:r>
+      <w:proofErr w:type="spellEnd"/>
+      <w:r>
+        <w:t xml:space="preserve"> → Database</w:t>
+      </w:r>
+    </w:p>
+    <w:p>
+      <w:pPr>
+        <w:ind w:firstLine="720"/>
+      </w:pPr>
+    </w:p>
+    <w:tbl>
+      <w:tblPr>
+        <w:tblStyle w:val="PlainTable1"/>
+        <w:tblW w:w="0" w:type="auto"/>
+        <w:tblLook w:val="04A0" w:firstRow="1" w:lastRow="0" w:firstColumn="1" w:lastColumn="0" w:noHBand="0" w:noVBand="1"/>
+      </w:tblPr>
+      <w:tblGrid>
+        <w:gridCol w:w="4829"/>
+        <w:gridCol w:w="4540"/>
+      </w:tblGrid>
+      <w:tr>
+        <w:trPr>
+          <w:cnfStyle w:val="100000000000" w:firstRow="1" w:lastRow="0" w:firstColumn="0" w:lastColumn="0" w:oddVBand="0" w:evenVBand="0" w:oddHBand="0" w:evenHBand="0" w:firstRowFirstColumn="0" w:firstRowLastColumn="0" w:lastRowFirstColumn="0" w:lastRowLastColumn="0"/>
+        </w:trPr>
+        <w:tc>
+          <w:tcPr>
+            <w:cnfStyle w:val="001000000000" w:firstRow="0" w:lastRow="0" w:firstColumn="1" w:lastColumn="0" w:oddVBand="0" w:evenVBand="0" w:oddHBand="0" w:evenHBand="0" w:firstRowFirstColumn="0" w:firstRowLastColumn="0" w:lastRowFirstColumn="0" w:lastRowLastColumn="0"/>
+            <w:tcW w:w="0" w:type="auto"/>
+            <w:hideMark/>
+          </w:tcPr>
+          <w:p>
+            <w:pPr>
+              <w:spacing w:after="160" w:line="278" w:lineRule="auto"/>
+            </w:pPr>
+            <w:r>
+              <w:t>Best Practice</w:t>
+            </w:r>
+          </w:p>
+        </w:tc>
+        <w:tc>
+          <w:tcPr>
+            <w:tcW w:w="0" w:type="auto"/>
+            <w:hideMark/>
+          </w:tcPr>
+          <w:p>
+            <w:pPr>
+              <w:spacing w:after="160" w:line="278" w:lineRule="auto"/>
+              <w:cnfStyle w:val="100000000000" w:firstRow="1" w:lastRow="0" w:firstColumn="0" w:lastColumn="0" w:oddVBand="0" w:evenVBand="0" w:oddHBand="0" w:evenHBand="0" w:firstRowFirstColumn="0" w:firstRowLastColumn="0" w:lastRowFirstColumn="0" w:lastRowLastColumn="0"/>
+            </w:pPr>
+            <w:r>
+              <w:t>Reason</w:t>
+            </w:r>
+          </w:p>
+        </w:tc>
+      </w:tr>
+      <w:tr>
+        <w:trPr>
+          <w:cnfStyle w:val="000000100000" w:firstRow="0" w:lastRow="0" w:firstColumn="0" w:lastColumn="0" w:oddVBand="0" w:evenVBand="0" w:oddHBand="1" w:evenHBand="0" w:firstRowFirstColumn="0" w:firstRowLastColumn="0" w:lastRowFirstColumn="0" w:lastRowLastColumn="0"/>
+        </w:trPr>
+        <w:tc>
+          <w:tcPr>
+            <w:cnfStyle w:val="001000000000" w:firstRow="0" w:lastRow="0" w:firstColumn="1" w:lastColumn="0" w:oddVBand="0" w:evenVBand="0" w:oddHBand="0" w:evenHBand="0" w:firstRowFirstColumn="0" w:firstRowLastColumn="0" w:lastRowFirstColumn="0" w:lastRowLastColumn="0"/>
+            <w:tcW w:w="0" w:type="auto"/>
+            <w:hideMark/>
+          </w:tcPr>
+          <w:p>
+            <w:pPr>
+              <w:spacing w:after="160" w:line="278" w:lineRule="auto"/>
+            </w:pPr>
+            <w:r>
+              <w:t>Use object references instead of foreign key IDs</w:t>
+            </w:r>
+          </w:p>
+        </w:tc>
+        <w:tc>
+          <w:tcPr>
+            <w:tcW w:w="0" w:type="auto"/>
+            <w:hideMark/>
+          </w:tcPr>
+          <w:p>
+            <w:pPr>
+              <w:spacing w:after="160" w:line="278" w:lineRule="auto"/>
+              <w:cnfStyle w:val="000000100000" w:firstRow="0" w:lastRow="0" w:firstColumn="0" w:lastColumn="0" w:oddVBand="0" w:evenVBand="0" w:oddHBand="1" w:evenHBand="0" w:firstRowFirstColumn="0" w:firstRowLastColumn="0" w:lastRowFirstColumn="0" w:lastRowLastColumn="0"/>
+            </w:pPr>
+            <w:r>
+              <w:t>JPA manages relationships</w:t>
+            </w:r>
+          </w:p>
+        </w:tc>
+      </w:tr>
+      <w:tr>
+        <w:tc>
+          <w:tcPr>
+            <w:cnfStyle w:val="001000000000" w:firstRow="0" w:lastRow="0" w:firstColumn="1" w:lastColumn="0" w:oddVBand="0" w:evenVBand="0" w:oddHBand="0" w:evenHBand="0" w:firstRowFirstColumn="0" w:firstRowLastColumn="0" w:lastRowFirstColumn="0" w:lastRowLastColumn="0"/>
+            <w:tcW w:w="0" w:type="auto"/>
+            <w:hideMark/>
+          </w:tcPr>
+          <w:p>
+            <w:pPr>
+              <w:spacing w:after="160" w:line="278" w:lineRule="auto"/>
+            </w:pPr>
+            <w:r>
+              <w:t xml:space="preserve">Use </w:t>
+            </w:r>
+            <w:proofErr w:type="spellStart"/>
+            <w:r>
+              <w:t>FetchType.LAZY</w:t>
+            </w:r>
+            <w:proofErr w:type="spellEnd"/>
+          </w:p>
+        </w:tc>
+        <w:tc>
+          <w:tcPr>
+            <w:tcW w:w="0" w:type="auto"/>
+            <w:hideMark/>
+          </w:tcPr>
+          <w:p>
+            <w:pPr>
+              <w:spacing w:after="160" w:line="278" w:lineRule="auto"/>
+              <w:cnfStyle w:val="000000000000" w:firstRow="0" w:lastRow="0" w:firstColumn="0" w:lastColumn="0" w:oddVBand="0" w:evenVBand="0" w:oddHBand="0" w:evenHBand="0" w:firstRowFirstColumn="0" w:firstRowLastColumn="0" w:lastRowFirstColumn="0" w:lastRowLastColumn="0"/>
+            </w:pPr>
+            <w:r>
+              <w:t>Better performance</w:t>
+            </w:r>
+          </w:p>
+        </w:tc>
+      </w:tr>
+      <w:tr>
+        <w:trPr>
+          <w:cnfStyle w:val="000000100000" w:firstRow="0" w:lastRow="0" w:firstColumn="0" w:lastColumn="0" w:oddVBand="0" w:evenVBand="0" w:oddHBand="1" w:evenHBand="0" w:firstRowFirstColumn="0" w:firstRowLastColumn="0" w:lastRowFirstColumn="0" w:lastRowLastColumn="0"/>
+        </w:trPr>
+        <w:tc>
+          <w:tcPr>
+            <w:cnfStyle w:val="001000000000" w:firstRow="0" w:lastRow="0" w:firstColumn="1" w:lastColumn="0" w:oddVBand="0" w:evenVBand="0" w:oddHBand="0" w:evenHBand="0" w:firstRowFirstColumn="0" w:firstRowLastColumn="0" w:lastRowFirstColumn="0" w:lastRowLastColumn="0"/>
+            <w:tcW w:w="0" w:type="auto"/>
+            <w:hideMark/>
+          </w:tcPr>
+          <w:p>
+            <w:pPr>
+              <w:spacing w:after="160" w:line="278" w:lineRule="auto"/>
+            </w:pPr>
+            <w:r>
+              <w:t>Always specify @JoinColumn</w:t>
+            </w:r>
+          </w:p>
+        </w:tc>
+        <w:tc>
+          <w:tcPr>
+            <w:tcW w:w="0" w:type="auto"/>
+            <w:hideMark/>
+          </w:tcPr>
+          <w:p>
+            <w:pPr>
+              <w:spacing w:after="160" w:line="278" w:lineRule="auto"/>
+              <w:cnfStyle w:val="000000100000" w:firstRow="0" w:lastRow="0" w:firstColumn="0" w:lastColumn="0" w:oddVBand="0" w:evenVBand="0" w:oddHBand="1" w:evenHBand="0" w:firstRowFirstColumn="0" w:firstRowLastColumn="0" w:lastRowFirstColumn="0" w:lastRowLastColumn="0"/>
+            </w:pPr>
+            <w:r>
+              <w:t>Clear foreign key mapping</w:t>
+            </w:r>
+          </w:p>
+        </w:tc>
+      </w:tr>
+      <w:tr>
+        <w:tc>
+          <w:tcPr>
+            <w:cnfStyle w:val="001000000000" w:firstRow="0" w:lastRow="0" w:firstColumn="1" w:lastColumn="0" w:oddVBand="0" w:evenVBand="0" w:oddHBand="0" w:evenHBand="0" w:firstRowFirstColumn="0" w:firstRowLastColumn="0" w:lastRowFirstColumn="0" w:lastRowLastColumn="0"/>
+            <w:tcW w:w="0" w:type="auto"/>
+            <w:hideMark/>
+          </w:tcPr>
+          <w:p>
+            <w:pPr>
+              <w:spacing w:after="160" w:line="278" w:lineRule="auto"/>
+            </w:pPr>
+            <w:r>
+              <w:t>Keep entities focused</w:t>
+            </w:r>
+          </w:p>
+        </w:tc>
+        <w:tc>
+          <w:tcPr>
+            <w:tcW w:w="0" w:type="auto"/>
+            <w:hideMark/>
+          </w:tcPr>
+          <w:p>
+            <w:pPr>
+              <w:spacing w:after="160" w:line="278" w:lineRule="auto"/>
+              <w:cnfStyle w:val="000000000000" w:firstRow="0" w:lastRow="0" w:firstColumn="0" w:lastColumn="0" w:oddVBand="0" w:evenVBand="0" w:oddHBand="0" w:evenHBand="0" w:firstRowFirstColumn="0" w:firstRowLastColumn="0" w:lastRowFirstColumn="0" w:lastRowLastColumn="0"/>
+            </w:pPr>
+            <w:r>
+              <w:t>Add reverse relationships only when needed</w:t>
+            </w:r>
+          </w:p>
+        </w:tc>
+      </w:tr>
+    </w:tbl>
+    <w:p>
+      <w:r>
+        <w:t xml:space="preserve"> </w:t>
+      </w:r>
+    </w:p>
+    <w:p>
+      <w:r>
+        <w:rPr>
+          <w:rFonts w:ascii="Segoe UI Emoji" w:hAnsi="Segoe UI Emoji" w:cs="Segoe UI Emoji"/>
+        </w:rPr>
+        <w:t>⬇️</w:t>
+      </w:r>
+    </w:p>
+    <w:p>
+      <w:r>
+        <w:rPr>
+          <w:b/>
+          <w:bCs/>
+        </w:rPr>
+        <w:t>Step 6</w:t>
+      </w:r>
+    </w:p>
+    <w:p>
+      <w:r>
+        <w:drawing>
+          <wp:inline distT="0" distB="0" distL="0" distR="0" wp14:anchorId="774476B1" wp14:editId="188A4EA0">
+            <wp:extent cx="3010320" cy="1552792"/>
+            <wp:effectExtent l="0" t="0" r="0" b="9525"/>
+            <wp:docPr id="1104754438" name="Picture 1"/>
+            <wp:cNvGraphicFramePr>
+              <a:graphicFrameLocks xmlns:a="http://schemas.openxmlformats.org/drawingml/2006/main" noChangeAspect="1"/>
+            </wp:cNvGraphicFramePr>
+            <a:graphic xmlns:a="http://schemas.openxmlformats.org/drawingml/2006/main">
+              <a:graphicData uri="http://schemas.openxmlformats.org/drawingml/2006/picture">
+                <pic:pic xmlns:pic="http://schemas.openxmlformats.org/drawingml/2006/picture">
+                  <pic:nvPicPr>
+                    <pic:cNvPr id="1104754438" name=""/>
+                    <pic:cNvPicPr/>
+                  </pic:nvPicPr>
+                  <pic:blipFill>
+                    <a:blip r:embed="rId28"/>
+                    <a:stretch>
+                      <a:fillRect/>
+                    </a:stretch>
+                  </pic:blipFill>
+                  <pic:spPr>
+                    <a:xfrm>
+                      <a:off x="0" y="0"/>
+                      <a:ext cx="3010320" cy="1552792"/>
+                    </a:xfrm>
+                    <a:prstGeom prst="rect">
+                      <a:avLst/>
+                    </a:prstGeom>
+                  </pic:spPr>
+                </pic:pic>
+              </a:graphicData>
+            </a:graphic>
+          </wp:inline>
+        </w:drawing>
+      </w:r>
+      <w:r>
+        <w:t xml:space="preserve"> </w:t>
+      </w:r>
+    </w:p>
+    <w:p>
+      <w:r>
+        <w:drawing>
+          <wp:inline distT="0" distB="0" distL="0" distR="0" wp14:anchorId="72F8E26F" wp14:editId="5113B329">
+            <wp:extent cx="3305636" cy="847843"/>
+            <wp:effectExtent l="0" t="0" r="9525" b="9525"/>
+            <wp:docPr id="1460806608" name="Picture 1"/>
+            <wp:cNvGraphicFramePr>
+              <a:graphicFrameLocks xmlns:a="http://schemas.openxmlformats.org/drawingml/2006/main" noChangeAspect="1"/>
+            </wp:cNvGraphicFramePr>
+            <a:graphic xmlns:a="http://schemas.openxmlformats.org/drawingml/2006/main">
+              <a:graphicData uri="http://schemas.openxmlformats.org/drawingml/2006/picture">
+                <pic:pic xmlns:pic="http://schemas.openxmlformats.org/drawingml/2006/picture">
+                  <pic:nvPicPr>
+                    <pic:cNvPr id="1460806608" name=""/>
+                    <pic:cNvPicPr/>
+                  </pic:nvPicPr>
+                  <pic:blipFill>
+                    <a:blip r:embed="rId29"/>
+                    <a:stretch>
+                      <a:fillRect/>
+                    </a:stretch>
+                  </pic:blipFill>
+                  <pic:spPr>
+                    <a:xfrm>
+                      <a:off x="0" y="0"/>
+                      <a:ext cx="3305636" cy="847843"/>
+                    </a:xfrm>
+                    <a:prstGeom prst="rect">
+                      <a:avLst/>
+                    </a:prstGeom>
+                  </pic:spPr>
+                </pic:pic>
+              </a:graphicData>
+            </a:graphic>
+          </wp:inline>
+        </w:drawing>
+      </w:r>
+    </w:p>
+    <w:p>
+      <w:r>
+        <w:rPr>
+          <w:rFonts w:ascii="Segoe UI Emoji" w:hAnsi="Segoe UI Emoji" w:cs="Segoe UI Emoji"/>
+        </w:rPr>
+        <w:t>⬇️</w:t>
+      </w:r>
+    </w:p>
+    <w:p>
+      <w:pPr>
+        <w:rPr>
+          <w:b/>
+          <w:bCs/>
+        </w:rPr>
+      </w:pPr>
+    </w:p>
+    <w:p>
+      <w:pPr>
+        <w:rPr>
+          <w:b/>
+          <w:bCs/>
+        </w:rPr>
+      </w:pPr>
+    </w:p>
+    <w:p>
+      <w:pPr>
+        <w:rPr>
+          <w:b/>
+          <w:bCs/>
+        </w:rPr>
+      </w:pPr>
+    </w:p>
+    <w:p>
+      <w:pPr>
+        <w:rPr>
+          <w:b/>
+          <w:bCs/>
+        </w:rPr>
+      </w:pPr>
+    </w:p>
+    <w:p>
+      <w:r>
+        <w:rPr>
+          <w:b/>
+          <w:bCs/>
+        </w:rPr>
+        <w:lastRenderedPageBreak/>
+        <w:t>Step 7</w:t>
+      </w:r>
+    </w:p>
+    <w:p>
+      <w:r>
+        <w:tab/>
       </w:r>
       <w:proofErr w:type="gramStart"/>
       <w:r>
-        <w:rPr>
-          <w:b/>
-          <w:bCs/>
-          <w:color w:val="EE0000"/>
-          <w:sz w:val="50"/>
-          <w:szCs w:val="50"/>
-        </w:rPr>
-        <w:t>here..</w:t>
+        <w:t>Created</w:t>
+      </w:r>
+      <w:r>
+        <w:t xml:space="preserve">  =</w:t>
       </w:r>
       <w:proofErr w:type="gramEnd"/>
-    </w:p>
-    <w:p>
-      <w:pPr>
-        <w:ind w:left="720"/>
-      </w:pPr>
-    </w:p>
+      <w:r>
+        <w:t xml:space="preserve"> &gt; </w:t>
+      </w:r>
+      <w:r>
+        <w:t>V5__create_permissions.sql</w:t>
+      </w:r>
+    </w:p>
+    <w:p>
+      <w:r>
+        <w:tab/>
+      </w:r>
+      <w:proofErr w:type="spellStart"/>
+      <w:proofErr w:type="gramStart"/>
+      <w:r>
+        <w:t>Ceated</w:t>
+      </w:r>
+      <w:proofErr w:type="spellEnd"/>
+      <w:r>
+        <w:t xml:space="preserve">  =</w:t>
+      </w:r>
+      <w:proofErr w:type="gramEnd"/>
+      <w:r>
+        <w:t xml:space="preserve"> &gt; Permission.java</w:t>
+      </w:r>
+    </w:p>
+    <w:p>
+      <w:r>
+        <w:drawing>
+          <wp:inline distT="0" distB="0" distL="0" distR="0" wp14:anchorId="29F6840C" wp14:editId="71348C1C">
+            <wp:extent cx="4077269" cy="1438476"/>
+            <wp:effectExtent l="0" t="0" r="0" b="9525"/>
+            <wp:docPr id="869735079" name="Picture 1"/>
+            <wp:cNvGraphicFramePr>
+              <a:graphicFrameLocks xmlns:a="http://schemas.openxmlformats.org/drawingml/2006/main" noChangeAspect="1"/>
+            </wp:cNvGraphicFramePr>
+            <a:graphic xmlns:a="http://schemas.openxmlformats.org/drawingml/2006/main">
+              <a:graphicData uri="http://schemas.openxmlformats.org/drawingml/2006/picture">
+                <pic:pic xmlns:pic="http://schemas.openxmlformats.org/drawingml/2006/picture">
+                  <pic:nvPicPr>
+                    <pic:cNvPr id="869735079" name=""/>
+                    <pic:cNvPicPr/>
+                  </pic:nvPicPr>
+                  <pic:blipFill>
+                    <a:blip r:embed="rId30"/>
+                    <a:stretch>
+                      <a:fillRect/>
+                    </a:stretch>
+                  </pic:blipFill>
+                  <pic:spPr>
+                    <a:xfrm>
+                      <a:off x="0" y="0"/>
+                      <a:ext cx="4077269" cy="1438476"/>
+                    </a:xfrm>
+                    <a:prstGeom prst="rect">
+                      <a:avLst/>
+                    </a:prstGeom>
+                  </pic:spPr>
+                </pic:pic>
+              </a:graphicData>
+            </a:graphic>
+          </wp:inline>
+        </w:drawing>
+      </w:r>
+    </w:p>
+    <w:p/>
     <w:p>
       <w:r>
         <w:rPr>
@@ -6964,18 +7970,85 @@
           <w:b/>
           <w:bCs/>
         </w:rPr>
-        <w:t>Step 5</w:t>
-      </w:r>
-    </w:p>
-    <w:p>
-      <w:pPr>
-        <w:numPr>
-          <w:ilvl w:val="0"/>
-          <w:numId w:val="28"/>
-        </w:numPr>
-      </w:pPr>
-      <w:r>
-        <w:t xml:space="preserve">Create Department </w:t>
+        <w:t>Step 8</w:t>
+      </w:r>
+    </w:p>
+    <w:p>
+      <w:r>
+        <w:drawing>
+          <wp:inline distT="0" distB="0" distL="0" distR="0" wp14:anchorId="066A705F" wp14:editId="3C65A3CF">
+            <wp:extent cx="3362794" cy="924054"/>
+            <wp:effectExtent l="0" t="0" r="9525" b="9525"/>
+            <wp:docPr id="1753115133" name="Picture 1"/>
+            <wp:cNvGraphicFramePr>
+              <a:graphicFrameLocks xmlns:a="http://schemas.openxmlformats.org/drawingml/2006/main" noChangeAspect="1"/>
+            </wp:cNvGraphicFramePr>
+            <a:graphic xmlns:a="http://schemas.openxmlformats.org/drawingml/2006/main">
+              <a:graphicData uri="http://schemas.openxmlformats.org/drawingml/2006/picture">
+                <pic:pic xmlns:pic="http://schemas.openxmlformats.org/drawingml/2006/picture">
+                  <pic:nvPicPr>
+                    <pic:cNvPr id="1753115133" name=""/>
+                    <pic:cNvPicPr/>
+                  </pic:nvPicPr>
+                  <pic:blipFill>
+                    <a:blip r:embed="rId31"/>
+                    <a:stretch>
+                      <a:fillRect/>
+                    </a:stretch>
+                  </pic:blipFill>
+                  <pic:spPr>
+                    <a:xfrm>
+                      <a:off x="0" y="0"/>
+                      <a:ext cx="3362794" cy="924054"/>
+                    </a:xfrm>
+                    <a:prstGeom prst="rect">
+                      <a:avLst/>
+                    </a:prstGeom>
+                  </pic:spPr>
+                </pic:pic>
+              </a:graphicData>
+            </a:graphic>
+          </wp:inline>
+        </w:drawing>
+      </w:r>
+    </w:p>
+    <w:p>
+      <w:r>
+        <w:drawing>
+          <wp:inline distT="0" distB="0" distL="0" distR="0" wp14:anchorId="7718DD18" wp14:editId="0FE6E30C">
+            <wp:extent cx="3753374" cy="1514686"/>
+            <wp:effectExtent l="0" t="0" r="0" b="9525"/>
+            <wp:docPr id="736272471" name="Picture 1"/>
+            <wp:cNvGraphicFramePr>
+              <a:graphicFrameLocks xmlns:a="http://schemas.openxmlformats.org/drawingml/2006/main" noChangeAspect="1"/>
+            </wp:cNvGraphicFramePr>
+            <a:graphic xmlns:a="http://schemas.openxmlformats.org/drawingml/2006/main">
+              <a:graphicData uri="http://schemas.openxmlformats.org/drawingml/2006/picture">
+                <pic:pic xmlns:pic="http://schemas.openxmlformats.org/drawingml/2006/picture">
+                  <pic:nvPicPr>
+                    <pic:cNvPr id="736272471" name=""/>
+                    <pic:cNvPicPr/>
+                  </pic:nvPicPr>
+                  <pic:blipFill>
+                    <a:blip r:embed="rId32"/>
+                    <a:stretch>
+                      <a:fillRect/>
+                    </a:stretch>
+                  </pic:blipFill>
+                  <pic:spPr>
+                    <a:xfrm>
+                      <a:off x="0" y="0"/>
+                      <a:ext cx="3753374" cy="1514686"/>
+                    </a:xfrm>
+                    <a:prstGeom prst="rect">
+                      <a:avLst/>
+                    </a:prstGeom>
+                  </pic:spPr>
+                </pic:pic>
+              </a:graphicData>
+            </a:graphic>
+          </wp:inline>
+        </w:drawing>
       </w:r>
     </w:p>
     <w:p>
@@ -6992,103 +8065,169 @@
           <w:b/>
           <w:bCs/>
         </w:rPr>
-        <w:t>Step 6</w:t>
-      </w:r>
-    </w:p>
-    <w:p>
-      <w:pPr>
-        <w:numPr>
-          <w:ilvl w:val="0"/>
-          <w:numId w:val="29"/>
-        </w:numPr>
-      </w:pPr>
-      <w:r>
-        <w:t xml:space="preserve">Create Role </w:t>
-      </w:r>
-    </w:p>
-    <w:p>
-      <w:r>
-        <w:rPr>
-          <w:rFonts w:ascii="Segoe UI Emoji" w:hAnsi="Segoe UI Emoji" w:cs="Segoe UI Emoji"/>
-        </w:rPr>
-        <w:t>⬇️</w:t>
-      </w:r>
-    </w:p>
-    <w:p>
-      <w:r>
-        <w:rPr>
-          <w:b/>
-          <w:bCs/>
-        </w:rPr>
-        <w:t>Step 7</w:t>
-      </w:r>
-    </w:p>
-    <w:p>
-      <w:pPr>
-        <w:numPr>
-          <w:ilvl w:val="0"/>
-          <w:numId w:val="30"/>
-        </w:numPr>
-      </w:pPr>
-      <w:r>
-        <w:t xml:space="preserve">Create Permission </w:t>
-      </w:r>
-    </w:p>
-    <w:p>
-      <w:r>
-        <w:rPr>
-          <w:rFonts w:ascii="Segoe UI Emoji" w:hAnsi="Segoe UI Emoji" w:cs="Segoe UI Emoji"/>
-        </w:rPr>
-        <w:t>⬇️</w:t>
-      </w:r>
-    </w:p>
-    <w:p>
-      <w:r>
-        <w:rPr>
-          <w:b/>
-          <w:bCs/>
-        </w:rPr>
+        <w:t>Step 9</w:t>
+      </w:r>
+    </w:p>
+    <w:p>
+      <w:r>
+        <w:tab/>
+      </w:r>
+      <w:r>
+        <w:drawing>
+          <wp:inline distT="0" distB="0" distL="0" distR="0" wp14:anchorId="5E1A2B0F" wp14:editId="2CF2CF4B">
+            <wp:extent cx="3915321" cy="1133633"/>
+            <wp:effectExtent l="0" t="0" r="9525" b="9525"/>
+            <wp:docPr id="1690453371" name="Picture 1"/>
+            <wp:cNvGraphicFramePr>
+              <a:graphicFrameLocks xmlns:a="http://schemas.openxmlformats.org/drawingml/2006/main" noChangeAspect="1"/>
+            </wp:cNvGraphicFramePr>
+            <a:graphic xmlns:a="http://schemas.openxmlformats.org/drawingml/2006/main">
+              <a:graphicData uri="http://schemas.openxmlformats.org/drawingml/2006/picture">
+                <pic:pic xmlns:pic="http://schemas.openxmlformats.org/drawingml/2006/picture">
+                  <pic:nvPicPr>
+                    <pic:cNvPr id="1690453371" name=""/>
+                    <pic:cNvPicPr/>
+                  </pic:nvPicPr>
+                  <pic:blipFill>
+                    <a:blip r:embed="rId33"/>
+                    <a:stretch>
+                      <a:fillRect/>
+                    </a:stretch>
+                  </pic:blipFill>
+                  <pic:spPr>
+                    <a:xfrm>
+                      <a:off x="0" y="0"/>
+                      <a:ext cx="3915321" cy="1133633"/>
+                    </a:xfrm>
+                    <a:prstGeom prst="rect">
+                      <a:avLst/>
+                    </a:prstGeom>
+                  </pic:spPr>
+                </pic:pic>
+              </a:graphicData>
+            </a:graphic>
+          </wp:inline>
+        </w:drawing>
+      </w:r>
+    </w:p>
+    <w:p>
+      <w:r>
+        <w:tab/>
+      </w:r>
+      <w:r>
+        <w:drawing>
+          <wp:inline distT="0" distB="0" distL="0" distR="0" wp14:anchorId="146E9AF4" wp14:editId="723B4B3E">
+            <wp:extent cx="3839111" cy="676369"/>
+            <wp:effectExtent l="0" t="0" r="9525" b="9525"/>
+            <wp:docPr id="1048565078" name="Picture 1"/>
+            <wp:cNvGraphicFramePr>
+              <a:graphicFrameLocks xmlns:a="http://schemas.openxmlformats.org/drawingml/2006/main" noChangeAspect="1"/>
+            </wp:cNvGraphicFramePr>
+            <a:graphic xmlns:a="http://schemas.openxmlformats.org/drawingml/2006/main">
+              <a:graphicData uri="http://schemas.openxmlformats.org/drawingml/2006/picture">
+                <pic:pic xmlns:pic="http://schemas.openxmlformats.org/drawingml/2006/picture">
+                  <pic:nvPicPr>
+                    <pic:cNvPr id="1048565078" name=""/>
+                    <pic:cNvPicPr/>
+                  </pic:nvPicPr>
+                  <pic:blipFill>
+                    <a:blip r:embed="rId34"/>
+                    <a:stretch>
+                      <a:fillRect/>
+                    </a:stretch>
+                  </pic:blipFill>
+                  <pic:spPr>
+                    <a:xfrm>
+                      <a:off x="0" y="0"/>
+                      <a:ext cx="3839111" cy="676369"/>
+                    </a:xfrm>
+                    <a:prstGeom prst="rect">
+                      <a:avLst/>
+                    </a:prstGeom>
+                  </pic:spPr>
+                </pic:pic>
+              </a:graphicData>
+            </a:graphic>
+          </wp:inline>
+        </w:drawing>
+      </w:r>
+    </w:p>
+    <w:p>
+      <w:r>
+        <w:tab/>
+        <w:t>Create entities =</w:t>
+      </w:r>
+      <w:proofErr w:type="gramStart"/>
+      <w:r>
+        <w:t xml:space="preserve">&gt;  </w:t>
+      </w:r>
+      <w:r>
+        <w:t>modules/authentication/entity/PasswordResetToken.java</w:t>
+      </w:r>
+      <w:proofErr w:type="gramEnd"/>
+      <w:r>
+        <w:t xml:space="preserve"> </w:t>
+      </w:r>
+    </w:p>
+    <w:p>
+      <w:r>
+        <w:tab/>
+      </w:r>
+      <w:r>
+        <w:tab/>
+      </w:r>
+      <w:r>
+        <w:tab/>
+        <w:t xml:space="preserve">      </w:t>
+      </w:r>
+      <w:r>
+        <w:t>modules/authentication/entity/</w:t>
+      </w:r>
+      <w:r>
+        <w:t xml:space="preserve"> </w:t>
+      </w:r>
+      <w:r>
+        <w:t>RefreshToken.java</w:t>
+      </w:r>
+    </w:p>
+    <w:p>
+      <w:r>
         <w:lastRenderedPageBreak/>
-        <w:t>Step 8</w:t>
-      </w:r>
-    </w:p>
-    <w:p>
-      <w:pPr>
-        <w:numPr>
-          <w:ilvl w:val="0"/>
-          <w:numId w:val="31"/>
-        </w:numPr>
-      </w:pPr>
-      <w:r>
-        <w:t xml:space="preserve">Create User </w:t>
-      </w:r>
-    </w:p>
-    <w:p>
-      <w:r>
-        <w:rPr>
-          <w:rFonts w:ascii="Segoe UI Emoji" w:hAnsi="Segoe UI Emoji" w:cs="Segoe UI Emoji"/>
-        </w:rPr>
-        <w:t>⬇️</w:t>
-      </w:r>
-    </w:p>
-    <w:p>
-      <w:r>
-        <w:rPr>
-          <w:b/>
-          <w:bCs/>
-        </w:rPr>
-        <w:t>Step 9</w:t>
-      </w:r>
-    </w:p>
-    <w:p>
-      <w:pPr>
-        <w:numPr>
-          <w:ilvl w:val="0"/>
-          <w:numId w:val="32"/>
-        </w:numPr>
-      </w:pPr>
-      <w:r>
-        <w:t xml:space="preserve">Create token entities </w:t>
+        <w:drawing>
+          <wp:inline distT="0" distB="0" distL="0" distR="0" wp14:anchorId="12ABE3F1" wp14:editId="4847D5F9">
+            <wp:extent cx="6645910" cy="1668780"/>
+            <wp:effectExtent l="0" t="0" r="2540" b="7620"/>
+            <wp:docPr id="836798934" name="Picture 1"/>
+            <wp:cNvGraphicFramePr>
+              <a:graphicFrameLocks xmlns:a="http://schemas.openxmlformats.org/drawingml/2006/main" noChangeAspect="1"/>
+            </wp:cNvGraphicFramePr>
+            <a:graphic xmlns:a="http://schemas.openxmlformats.org/drawingml/2006/main">
+              <a:graphicData uri="http://schemas.openxmlformats.org/drawingml/2006/picture">
+                <pic:pic xmlns:pic="http://schemas.openxmlformats.org/drawingml/2006/picture">
+                  <pic:nvPicPr>
+                    <pic:cNvPr id="836798934" name=""/>
+                    <pic:cNvPicPr/>
+                  </pic:nvPicPr>
+                  <pic:blipFill>
+                    <a:blip r:embed="rId35"/>
+                    <a:stretch>
+                      <a:fillRect/>
+                    </a:stretch>
+                  </pic:blipFill>
+                  <pic:spPr>
+                    <a:xfrm>
+                      <a:off x="0" y="0"/>
+                      <a:ext cx="6645910" cy="1668780"/>
+                    </a:xfrm>
+                    <a:prstGeom prst="rect">
+                      <a:avLst/>
+                    </a:prstGeom>
+                  </pic:spPr>
+                </pic:pic>
+              </a:graphicData>
+            </a:graphic>
+          </wp:inline>
+        </w:drawing>
       </w:r>
     </w:p>
     <w:p>
@@ -7227,8 +8366,13 @@
           <w:numId w:val="37"/>
         </w:numPr>
       </w:pPr>
-      <w:r>
-        <w:t xml:space="preserve">BCrypt configuration </w:t>
+      <w:proofErr w:type="spellStart"/>
+      <w:r>
+        <w:t>BCrypt</w:t>
+      </w:r>
+      <w:proofErr w:type="spellEnd"/>
+      <w:r>
+        <w:t xml:space="preserve"> configuration </w:t>
       </w:r>
     </w:p>
     <w:p>
@@ -13994,7 +15138,6 @@
   <w:style w:type="character" w:default="1" w:styleId="DefaultParagraphFont">
     <w:name w:val="Default Paragraph Font"/>
     <w:uiPriority w:val="1"/>
-    <w:semiHidden/>
     <w:unhideWhenUsed/>
   </w:style>
   <w:style w:type="table" w:default="1" w:styleId="TableNormal">
@@ -14413,6 +15556,36 @@
       </w:tblBorders>
     </w:tblPr>
   </w:style>
+  <w:style w:type="paragraph" w:styleId="HTMLPreformatted">
+    <w:name w:val="HTML Preformatted"/>
+    <w:basedOn w:val="Normal"/>
+    <w:link w:val="HTMLPreformattedChar"/>
+    <w:uiPriority w:val="99"/>
+    <w:semiHidden/>
+    <w:unhideWhenUsed/>
+    <w:rsid w:val="003525E9"/>
+    <w:pPr>
+      <w:spacing w:after="0" w:line="240" w:lineRule="auto"/>
+    </w:pPr>
+    <w:rPr>
+      <w:rFonts w:ascii="Consolas" w:hAnsi="Consolas"/>
+      <w:sz w:val="20"/>
+      <w:szCs w:val="20"/>
+    </w:rPr>
+  </w:style>
+  <w:style w:type="character" w:customStyle="1" w:styleId="HTMLPreformattedChar">
+    <w:name w:val="HTML Preformatted Char"/>
+    <w:basedOn w:val="DefaultParagraphFont"/>
+    <w:link w:val="HTMLPreformatted"/>
+    <w:uiPriority w:val="99"/>
+    <w:semiHidden/>
+    <w:rsid w:val="003525E9"/>
+    <w:rPr>
+      <w:rFonts w:ascii="Consolas" w:hAnsi="Consolas"/>
+      <w:sz w:val="20"/>
+      <w:szCs w:val="20"/>
+    </w:rPr>
+  </w:style>
 </w:styles>
 </file>
 

</xml_diff>